<commit_message>
Plantillas de Word corregidas y listas
</commit_message>
<xml_diff>
--- a/plantilla_int.docx
+++ b/plantilla_int.docx
@@ -290,7 +290,7 @@
                                   <w:pPr>
                                     <w:widowControl w:val="0"/>
                                     <w:rPr>
-                                      <w:rFonts w:ascii="MingLiU-ExtB" w:eastAsia="MingLiU-ExtB" w:hAnsi="MingLiU-ExtB" w:cs="MingLiU-ExtB" w:hint="eastAsia"/>
+                                      <w:rFonts w:ascii="MingLiU-ExtB" w:eastAsia="MingLiU-ExtB" w:hAnsi="MingLiU-ExtB" w:cs="MingLiU-ExtB"/>
                                       <w:b/>
                                       <w:sz w:val="20"/>
                                       <w:szCs w:val="20"/>
@@ -567,7 +567,7 @@
                     </wp:anchor>
                   </w:drawing>
                 </mc:Choice>
-                <mc:Fallback xmlns:w16sdtfl="http://schemas.microsoft.com/office/word/2024/wordml/sdtformatlock" xmlns:w16sdtdh="http://schemas.microsoft.com/office/word/2020/wordml/sdtdatahash" xmlns:w16du="http://schemas.microsoft.com/office/word/2023/wordml/word16du" xmlns:w16="http://schemas.microsoft.com/office/word/2018/wordml" xmlns:w16cid="http://schemas.microsoft.com/office/word/2016/wordml/cid" xmlns:w16cex="http://schemas.microsoft.com/office/word/2018/wordml/cex" xmlns:oel="http://schemas.microsoft.com/office/2019/extlst" xmlns:am3d="http://schemas.microsoft.com/office/drawing/2017/model3d" xmlns:aink="http://schemas.microsoft.com/office/drawing/2016/ink" xmlns:cx8="http://schemas.microsoft.com/office/drawing/2016/5/14/chartex" xmlns:cx7="http://schemas.microsoft.com/office/drawing/2016/5/13/chartex" xmlns:cx6="http://schemas.microsoft.com/office/drawing/2016/5/12/chartex" xmlns:cx5="http://schemas.microsoft.com/office/drawing/2016/5/11/chartex" xmlns:cx4="http://schemas.microsoft.com/office/drawing/2016/5/10/chartex" xmlns:cx3="http://schemas.microsoft.com/office/drawing/2016/5/9/chartex" xmlns:cx2="http://schemas.microsoft.com/office/drawing/2015/10/21/chartex" xmlns:cx1="http://schemas.microsoft.com/office/drawing/2015/9/8/chartex">
+                <mc:Fallback xmlns:cx1="http://schemas.microsoft.com/office/drawing/2015/9/8/chartex" xmlns:cx2="http://schemas.microsoft.com/office/drawing/2015/10/21/chartex" xmlns:cx3="http://schemas.microsoft.com/office/drawing/2016/5/9/chartex" xmlns:cx4="http://schemas.microsoft.com/office/drawing/2016/5/10/chartex" xmlns:cx5="http://schemas.microsoft.com/office/drawing/2016/5/11/chartex" xmlns:cx6="http://schemas.microsoft.com/office/drawing/2016/5/12/chartex" xmlns:cx7="http://schemas.microsoft.com/office/drawing/2016/5/13/chartex" xmlns:cx8="http://schemas.microsoft.com/office/drawing/2016/5/14/chartex" xmlns:aink="http://schemas.microsoft.com/office/drawing/2016/ink" xmlns:am3d="http://schemas.microsoft.com/office/drawing/2017/model3d" xmlns:oel="http://schemas.microsoft.com/office/2019/extlst" xmlns:w16cex="http://schemas.microsoft.com/office/word/2018/wordml/cex" xmlns:w16cid="http://schemas.microsoft.com/office/word/2016/wordml/cid" xmlns:w16="http://schemas.microsoft.com/office/word/2018/wordml" xmlns:w16du="http://schemas.microsoft.com/office/word/2023/wordml/word16du" xmlns:w16sdtdh="http://schemas.microsoft.com/office/word/2020/wordml/sdtdatahash" xmlns:w16sdtfl="http://schemas.microsoft.com/office/word/2024/wordml/sdtformatlock">
                   <w:pict>
                     <v:line w14:anchorId="4C297CA5" id="Conector recto 6" o:spid="_x0000_s1026" style="position:absolute;flip:y;z-index:251670528;visibility:visible;mso-wrap-style:square;mso-wrap-distance-left:9pt;mso-wrap-distance-top:0;mso-wrap-distance-right:9pt;mso-wrap-distance-bottom:0;mso-position-horizontal:absolute;mso-position-horizontal-relative:text;mso-position-vertical:absolute;mso-position-vertical-relative:text" from="-47.5pt,8.85pt" to="508.7pt,11.25pt" o:gfxdata="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" strokecolor="black [3040]"/>
                   </w:pict>
@@ -592,74 +592,6 @@
                 <w:color w:val="000000" w:themeColor="text1"/>
               </w:rPr>
             </w:pPr>
-            <w:r>
-              <w:rPr>
-                <w:rFonts w:ascii="Arial" w:hAnsi="Arial" w:cs="Arial"/>
-                <w:noProof/>
-                <w:sz w:val="20"/>
-                <w:szCs w:val="20"/>
-                <w:lang w:val="en-US"/>
-              </w:rPr>
-              <w:drawing>
-                <wp:anchor distT="0" distB="0" distL="114300" distR="114300" simplePos="0" relativeHeight="251667455" behindDoc="1" locked="0" layoutInCell="1" allowOverlap="1" wp14:anchorId="1E25E80B" wp14:editId="021BC45B">
-                  <wp:simplePos x="0" y="0"/>
-                  <wp:positionH relativeFrom="column">
-                    <wp:posOffset>-4078605</wp:posOffset>
-                  </wp:positionH>
-                  <wp:positionV relativeFrom="paragraph">
-                    <wp:posOffset>-1640205</wp:posOffset>
-                  </wp:positionV>
-                  <wp:extent cx="7659370" cy="4541520"/>
-                  <wp:effectExtent l="0" t="0" r="0" b="0"/>
-                  <wp:wrapNone/>
-                  <wp:docPr id="1795996338" name="Imagen 2" descr="Imagen que contiene Patrón de fondo&#10;&#10;El contenido generado por IA puede ser incorrecto."/>
-                  <wp:cNvGraphicFramePr>
-                    <a:graphicFrameLocks xmlns:a="http://schemas.openxmlformats.org/drawingml/2006/main" noChangeAspect="1"/>
-                  </wp:cNvGraphicFramePr>
-                  <a:graphic xmlns:a="http://schemas.openxmlformats.org/drawingml/2006/main">
-                    <a:graphicData uri="http://schemas.openxmlformats.org/drawingml/2006/picture">
-                      <pic:pic xmlns:pic="http://schemas.openxmlformats.org/drawingml/2006/picture">
-                        <pic:nvPicPr>
-                          <pic:cNvPr id="1996012099" name="Imagen 2" descr="Imagen que contiene Patrón de fondo&#10;&#10;El contenido generado por IA puede ser incorrecto."/>
-                          <pic:cNvPicPr/>
-                        </pic:nvPicPr>
-                        <pic:blipFill>
-                          <a:blip r:embed="rId12">
-                            <a:alphaModFix amt="35000"/>
-                            <a:extLst>
-                              <a:ext uri="">
-                                <a14:useLocalDpi xmlns:a14="http://schemas.microsoft.com/office/drawing/2010/main" xmlns:w="http://schemas.openxmlformats.org/wordprocessingml/2006/main" xmlns:w10="urn:schemas-microsoft-com:office:word" xmlns:v="urn:schemas-microsoft-com:vml" xmlns:o="urn:schemas-microsoft-com:office:office" xmlns="" xmlns:w16sdtfl="http://schemas.microsoft.com/office/word/2024/wordml/sdtformatlock" xmlns:w16sdtdh="http://schemas.microsoft.com/office/word/2020/wordml/sdtdatahash" xmlns:w16du="http://schemas.microsoft.com/office/word/2023/wordml/word16du" xmlns:w16="http://schemas.microsoft.com/office/word/2018/wordml" xmlns:w16cid="http://schemas.microsoft.com/office/word/2016/wordml/cid" xmlns:w16cex="http://schemas.microsoft.com/office/word/2018/wordml/cex" xmlns:oel="http://schemas.microsoft.com/office/2019/extlst" xmlns:am3d="http://schemas.microsoft.com/office/drawing/2017/model3d" xmlns:aink="http://schemas.microsoft.com/office/drawing/2016/ink" xmlns:cx8="http://schemas.microsoft.com/office/drawing/2016/5/14/chartex" xmlns:cx7="http://schemas.microsoft.com/office/drawing/2016/5/13/chartex" xmlns:cx6="http://schemas.microsoft.com/office/drawing/2016/5/12/chartex" xmlns:cx5="http://schemas.microsoft.com/office/drawing/2016/5/11/chartex" xmlns:cx4="http://schemas.microsoft.com/office/drawing/2016/5/10/chartex" xmlns:cx3="http://schemas.microsoft.com/office/drawing/2016/5/9/chartex" xmlns:cx2="http://schemas.microsoft.com/office/drawing/2015/10/21/chartex" xmlns:cx1="http://schemas.microsoft.com/office/drawing/2015/9/8/chartex" val="0"/>
-                              </a:ext>
-                            </a:extLst>
-                          </a:blip>
-                          <a:stretch>
-                            <a:fillRect/>
-                          </a:stretch>
-                        </pic:blipFill>
-                        <pic:spPr>
-                          <a:xfrm>
-                            <a:off x="0" y="0"/>
-                            <a:ext cx="7659370" cy="4541520"/>
-                          </a:xfrm>
-                          <a:prstGeom prst="rect">
-                            <a:avLst/>
-                          </a:prstGeom>
-                          <a:effectLst>
-                            <a:softEdge rad="203200"/>
-                          </a:effectLst>
-                        </pic:spPr>
-                      </pic:pic>
-                    </a:graphicData>
-                  </a:graphic>
-                  <wp14:sizeRelH relativeFrom="margin">
-                    <wp14:pctWidth>0</wp14:pctWidth>
-                  </wp14:sizeRelH>
-                  <wp14:sizeRelV relativeFrom="margin">
-                    <wp14:pctHeight>0</wp14:pctHeight>
-                  </wp14:sizeRelV>
-                </wp:anchor>
-              </w:drawing>
-            </w:r>
           </w:p>
         </w:tc>
       </w:tr>
@@ -679,7 +611,7 @@
         <mc:AlternateContent>
           <mc:Choice Requires="wps">
             <w:drawing>
-              <wp:anchor distT="0" distB="0" distL="114300" distR="114300" simplePos="0" relativeHeight="251669504" behindDoc="0" locked="0" layoutInCell="1" allowOverlap="1" wp14:anchorId="674C412F" wp14:editId="2B6CB2CA">
+              <wp:anchor distT="0" distB="0" distL="114300" distR="114300" simplePos="0" relativeHeight="251669504" behindDoc="0" locked="0" layoutInCell="1" allowOverlap="1" wp14:anchorId="674C412F" wp14:editId="6CE0923A">
                 <wp:simplePos x="0" y="0"/>
                 <wp:positionH relativeFrom="column">
                   <wp:posOffset>-431800</wp:posOffset>
@@ -861,7 +793,11 @@
           </mc:Choice>
           <mc:Fallback>
             <w:pict>
-              <v:shape w14:anchorId="674C412F" id="Cuadro de texto 5" o:spid="_x0000_s1027" type="#_x0000_t202" style="position:absolute;margin-left:-34pt;margin-top:-224.3pt;width:183.6pt;height:80.4pt;z-index:251669504;visibility:visible;mso-wrap-style:square;mso-width-percent:0;mso-height-percent:0;mso-wrap-distance-left:9pt;mso-wrap-distance-top:0;mso-wrap-distance-right:9pt;mso-wrap-distance-bottom:0;mso-position-horizontal:absolute;mso-position-horizontal-relative:text;mso-position-vertical:absolute;mso-position-vertical-relative:text;mso-width-percent:0;mso-height-percent:0;mso-width-relative:margin;mso-height-relative:margin;v-text-anchor:top" o:gfxdata="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" filled="f" stroked="f" strokeweight=".5pt">
+              <v:shapetype w14:anchorId="674C412F" id="_x0000_t202" coordsize="21600,21600" o:spt="202" path="m,l,21600r21600,l21600,xe">
+                <v:stroke joinstyle="miter"/>
+                <v:path gradientshapeok="t" o:connecttype="rect"/>
+              </v:shapetype>
+              <v:shape id="Cuadro de texto 5" o:spid="_x0000_s1027" type="#_x0000_t202" style="position:absolute;margin-left:-34pt;margin-top:-224.3pt;width:183.6pt;height:80.4pt;z-index:251669504;visibility:visible;mso-wrap-style:square;mso-width-percent:0;mso-height-percent:0;mso-wrap-distance-left:9pt;mso-wrap-distance-top:0;mso-wrap-distance-right:9pt;mso-wrap-distance-bottom:0;mso-position-horizontal:absolute;mso-position-horizontal-relative:text;mso-position-vertical:absolute;mso-position-vertical-relative:text;mso-width-percent:0;mso-height-percent:0;mso-width-relative:margin;mso-height-relative:margin;v-text-anchor:top" o:gfxdata="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" filled="f" stroked="f" strokeweight=".5pt">
                 <v:textbox>
                   <w:txbxContent>
                     <w:p>
@@ -1011,8 +947,8 @@
       <w:tblGrid>
         <w:gridCol w:w="1413"/>
         <w:gridCol w:w="1559"/>
-        <w:gridCol w:w="851"/>
-        <w:gridCol w:w="1275"/>
+        <w:gridCol w:w="1134"/>
+        <w:gridCol w:w="992"/>
         <w:gridCol w:w="3119"/>
         <w:gridCol w:w="1417"/>
       </w:tblGrid>
@@ -1065,7 +1001,7 @@
         </w:tc>
         <w:tc>
           <w:tcPr>
-            <w:tcW w:w="851" w:type="dxa"/>
+            <w:tcW w:w="1134" w:type="dxa"/>
           </w:tcPr>
           <w:p>
             <w:pPr>
@@ -1085,7 +1021,7 @@
         </w:tc>
         <w:tc>
           <w:tcPr>
-            <w:tcW w:w="1275" w:type="dxa"/>
+            <w:tcW w:w="992" w:type="dxa"/>
           </w:tcPr>
           <w:p>
             <w:pPr>
@@ -1200,23 +1136,21 @@
         </w:tc>
         <w:tc>
           <w:tcPr>
-            <w:tcW w:w="851" w:type="dxa"/>
+            <w:tcW w:w="1134" w:type="dxa"/>
           </w:tcPr>
           <w:p>
             <w:pPr>
               <w:ind w:left="142"/>
               <w:rPr>
                 <w:rFonts w:ascii="Arial" w:eastAsia="Arial" w:hAnsi="Arial" w:cs="Arial"/>
-                <w:sz w:val="20"/>
-                <w:szCs w:val="20"/>
+                <w:sz w:val="18"/>
                 <w:lang w:val="es-AR"/>
               </w:rPr>
             </w:pPr>
             <w:r>
               <w:rPr>
                 <w:rFonts w:ascii="Arial" w:eastAsia="Arial" w:hAnsi="Arial" w:cs="Arial"/>
-                <w:sz w:val="20"/>
-                <w:szCs w:val="20"/>
+                <w:sz w:val="18"/>
                 <w:lang w:val="es-AR"/>
               </w:rPr>
               <w:t>{{cotiz.}}</w:t>
@@ -1225,7 +1159,7 @@
         </w:tc>
         <w:tc>
           <w:tcPr>
-            <w:tcW w:w="1275" w:type="dxa"/>
+            <w:tcW w:w="992" w:type="dxa"/>
           </w:tcPr>
           <w:p>
             <w:pPr>
@@ -1287,17 +1221,17 @@
     <w:tbl>
       <w:tblPr>
         <w:tblStyle w:val="Tabladecuadrcula4-nfasis4"/>
-        <w:tblW w:w="9634" w:type="dxa"/>
+        <w:tblW w:w="10485" w:type="dxa"/>
         <w:tblLayout w:type="fixed"/>
         <w:tblLook w:val="04A0" w:firstRow="1" w:lastRow="0" w:firstColumn="1" w:lastColumn="0" w:noHBand="0" w:noVBand="1"/>
       </w:tblPr>
       <w:tblGrid>
-        <w:gridCol w:w="1129"/>
-        <w:gridCol w:w="3969"/>
-        <w:gridCol w:w="1134"/>
-        <w:gridCol w:w="993"/>
+        <w:gridCol w:w="2122"/>
         <w:gridCol w:w="1275"/>
-        <w:gridCol w:w="1134"/>
+        <w:gridCol w:w="709"/>
+        <w:gridCol w:w="1418"/>
+        <w:gridCol w:w="2976"/>
+        <w:gridCol w:w="1985"/>
       </w:tblGrid>
       <w:tr>
         <w:trPr>
@@ -1306,7 +1240,7 @@
         <w:tc>
           <w:tcPr>
             <w:cnfStyle w:val="001000000000" w:firstRow="0" w:lastRow="0" w:firstColumn="1" w:lastColumn="0" w:oddVBand="0" w:evenVBand="0" w:oddHBand="0" w:evenHBand="0" w:firstRowFirstColumn="0" w:firstRowLastColumn="0" w:lastRowFirstColumn="0" w:lastRowLastColumn="0"/>
-            <w:tcW w:w="1129" w:type="dxa"/>
+            <w:tcW w:w="2122" w:type="dxa"/>
           </w:tcPr>
           <w:p>
             <w:r>
@@ -1316,7 +1250,7 @@
         </w:tc>
         <w:tc>
           <w:tcPr>
-            <w:tcW w:w="3969" w:type="dxa"/>
+            <w:tcW w:w="1275" w:type="dxa"/>
           </w:tcPr>
           <w:p>
             <w:pPr>
@@ -1329,7 +1263,7 @@
         </w:tc>
         <w:tc>
           <w:tcPr>
-            <w:tcW w:w="1134" w:type="dxa"/>
+            <w:tcW w:w="709" w:type="dxa"/>
           </w:tcPr>
           <w:p>
             <w:pPr>
@@ -1342,7 +1276,7 @@
         </w:tc>
         <w:tc>
           <w:tcPr>
-            <w:tcW w:w="993" w:type="dxa"/>
+            <w:tcW w:w="1418" w:type="dxa"/>
           </w:tcPr>
           <w:p>
             <w:pPr>
@@ -1356,7 +1290,7 @@
         </w:tc>
         <w:tc>
           <w:tcPr>
-            <w:tcW w:w="1275" w:type="dxa"/>
+            <w:tcW w:w="2976" w:type="dxa"/>
           </w:tcPr>
           <w:p>
             <w:pPr>
@@ -1369,7 +1303,7 @@
         </w:tc>
         <w:tc>
           <w:tcPr>
-            <w:tcW w:w="1134" w:type="dxa"/>
+            <w:tcW w:w="1985" w:type="dxa"/>
           </w:tcPr>
           <w:p>
             <w:pPr>
@@ -1389,82 +1323,38 @@
         <w:tc>
           <w:tcPr>
             <w:cnfStyle w:val="001000000000" w:firstRow="0" w:lastRow="0" w:firstColumn="1" w:lastColumn="0" w:oddVBand="0" w:evenVBand="0" w:oddHBand="0" w:evenHBand="0" w:firstRowFirstColumn="0" w:firstRowLastColumn="0" w:lastRowFirstColumn="0" w:lastRowLastColumn="0"/>
-            <w:tcW w:w="1129" w:type="dxa"/>
+            <w:tcW w:w="2122" w:type="dxa"/>
           </w:tcPr>
           <w:p>
             <w:pPr>
               <w:rPr>
                 <w:color w:val="000000" w:themeColor="text1"/>
+                <w:szCs w:val="16"/>
               </w:rPr>
             </w:pPr>
             <w:r>
               <w:rPr>
                 <w:rStyle w:val="CdigoHTML"/>
                 <w:rFonts w:eastAsiaTheme="minorEastAsia"/>
+                <w:sz w:val="16"/>
+                <w:szCs w:val="16"/>
               </w:rPr>
               <w:t>{% tr for item in productos %}</w:t>
             </w:r>
             <w:r>
+              <w:rPr>
+                <w:szCs w:val="16"/>
+              </w:rPr>
               <w:t xml:space="preserve"> </w:t>
             </w:r>
             <w:r>
               <w:rPr>
                 <w:rStyle w:val="CdigoHTML"/>
                 <w:rFonts w:eastAsiaTheme="minorEastAsia"/>
+                <w:sz w:val="16"/>
+                <w:szCs w:val="16"/>
               </w:rPr>
               <w:t>{{item.nombre}}</w:t>
-            </w:r>
-          </w:p>
-        </w:tc>
-        <w:tc>
-          <w:tcPr>
-            <w:tcW w:w="3969" w:type="dxa"/>
-          </w:tcPr>
-          <w:p>
-            <w:pPr>
-              <w:cnfStyle w:val="000000100000" w:firstRow="0" w:lastRow="0" w:firstColumn="0" w:lastColumn="0" w:oddVBand="0" w:evenVBand="0" w:oddHBand="1" w:evenHBand="0" w:firstRowFirstColumn="0" w:firstRowLastColumn="0" w:lastRowFirstColumn="0" w:lastRowLastColumn="0"/>
-              <w:rPr>
-                <w:color w:val="000000" w:themeColor="text1"/>
-                <w:lang w:val="es-AR"/>
-              </w:rPr>
-            </w:pPr>
-            <w:r>
-              <w:t>{{item.desc}}</w:t>
-            </w:r>
-          </w:p>
-        </w:tc>
-        <w:tc>
-          <w:tcPr>
-            <w:tcW w:w="1134" w:type="dxa"/>
-          </w:tcPr>
-          <w:p>
-            <w:pPr>
-              <w:cnfStyle w:val="000000100000" w:firstRow="0" w:lastRow="0" w:firstColumn="0" w:lastColumn="0" w:oddVBand="0" w:evenVBand="0" w:oddHBand="1" w:evenHBand="0" w:firstRowFirstColumn="0" w:firstRowLastColumn="0" w:lastRowFirstColumn="0" w:lastRowLastColumn="0"/>
-              <w:rPr>
-                <w:color w:val="000000" w:themeColor="text1"/>
-              </w:rPr>
-            </w:pPr>
-            <w:r>
-              <w:rPr>
-                <w:color w:val="000000" w:themeColor="text1"/>
-              </w:rPr>
-              <w:t>1 pcs.</w:t>
-            </w:r>
-          </w:p>
-        </w:tc>
-        <w:tc>
-          <w:tcPr>
-            <w:tcW w:w="993" w:type="dxa"/>
-          </w:tcPr>
-          <w:p>
-            <w:pPr>
-              <w:cnfStyle w:val="000000100000" w:firstRow="0" w:lastRow="0" w:firstColumn="0" w:lastColumn="0" w:oddVBand="0" w:evenVBand="0" w:oddHBand="1" w:evenHBand="0" w:firstRowFirstColumn="0" w:firstRowLastColumn="0" w:lastRowFirstColumn="0" w:lastRowLastColumn="0"/>
-              <w:rPr>
-                <w:color w:val="000000" w:themeColor="text1"/>
-              </w:rPr>
-            </w:pPr>
-            <w:r>
-              <w:t>{{item.precio}}</w:t>
             </w:r>
           </w:p>
         </w:tc>
@@ -1477,6 +1367,126 @@
               <w:cnfStyle w:val="000000100000" w:firstRow="0" w:lastRow="0" w:firstColumn="0" w:lastColumn="0" w:oddVBand="0" w:evenVBand="0" w:oddHBand="1" w:evenHBand="0" w:firstRowFirstColumn="0" w:firstRowLastColumn="0" w:lastRowFirstColumn="0" w:lastRowLastColumn="0"/>
               <w:rPr>
                 <w:color w:val="000000" w:themeColor="text1"/>
+                <w:lang w:val="es-AR"/>
+              </w:rPr>
+            </w:pPr>
+            <w:r>
+              <w:rPr>
+                <w:rFonts w:ascii="Arial" w:hAnsi="Arial" w:cs="Arial"/>
+                <w:noProof/>
+                <w:sz w:val="20"/>
+                <w:szCs w:val="20"/>
+                <w:lang w:val="en-US"/>
+              </w:rPr>
+              <w:drawing>
+                <wp:anchor distT="0" distB="0" distL="114300" distR="114300" simplePos="0" relativeHeight="251667455" behindDoc="1" locked="0" layoutInCell="1" allowOverlap="1" wp14:anchorId="1E25E80B" wp14:editId="2F71FCA3">
+                  <wp:simplePos x="0" y="0"/>
+                  <wp:positionH relativeFrom="column">
+                    <wp:posOffset>-2015490</wp:posOffset>
+                  </wp:positionH>
+                  <wp:positionV relativeFrom="paragraph">
+                    <wp:posOffset>-4150995</wp:posOffset>
+                  </wp:positionV>
+                  <wp:extent cx="7659370" cy="4541520"/>
+                  <wp:effectExtent l="0" t="0" r="0" b="0"/>
+                  <wp:wrapNone/>
+                  <wp:docPr id="1795996338" name="Imagen 2" descr="Imagen que contiene Patrón de fondo&#10;&#10;El contenido generado por IA puede ser incorrecto."/>
+                  <wp:cNvGraphicFramePr>
+                    <a:graphicFrameLocks xmlns:a="http://schemas.openxmlformats.org/drawingml/2006/main" noChangeAspect="1"/>
+                  </wp:cNvGraphicFramePr>
+                  <a:graphic xmlns:a="http://schemas.openxmlformats.org/drawingml/2006/main">
+                    <a:graphicData uri="http://schemas.openxmlformats.org/drawingml/2006/picture">
+                      <pic:pic xmlns:pic="http://schemas.openxmlformats.org/drawingml/2006/picture">
+                        <pic:nvPicPr>
+                          <pic:cNvPr id="1996012099" name="Imagen 2" descr="Imagen que contiene Patrón de fondo&#10;&#10;El contenido generado por IA puede ser incorrecto."/>
+                          <pic:cNvPicPr/>
+                        </pic:nvPicPr>
+                        <pic:blipFill>
+                          <a:blip r:embed="rId12">
+                            <a:alphaModFix amt="35000"/>
+                            <a:extLst>
+                              <a:ext uri="">
+                                <a14:useLocalDpi xmlns:cx1="http://schemas.microsoft.com/office/drawing/2015/9/8/chartex" xmlns:cx2="http://schemas.microsoft.com/office/drawing/2015/10/21/chartex" xmlns:cx3="http://schemas.microsoft.com/office/drawing/2016/5/9/chartex" xmlns:cx4="http://schemas.microsoft.com/office/drawing/2016/5/10/chartex" xmlns:cx5="http://schemas.microsoft.com/office/drawing/2016/5/11/chartex" xmlns:cx6="http://schemas.microsoft.com/office/drawing/2016/5/12/chartex" xmlns:cx7="http://schemas.microsoft.com/office/drawing/2016/5/13/chartex" xmlns:cx8="http://schemas.microsoft.com/office/drawing/2016/5/14/chartex" xmlns:aink="http://schemas.microsoft.com/office/drawing/2016/ink" xmlns:am3d="http://schemas.microsoft.com/office/drawing/2017/model3d" xmlns:oel="http://schemas.microsoft.com/office/2019/extlst" xmlns:w16cex="http://schemas.microsoft.com/office/word/2018/wordml/cex" xmlns:w16cid="http://schemas.microsoft.com/office/word/2016/wordml/cid" xmlns:w16="http://schemas.microsoft.com/office/word/2018/wordml" xmlns:w16du="http://schemas.microsoft.com/office/word/2023/wordml/word16du" xmlns:w16sdtdh="http://schemas.microsoft.com/office/word/2020/wordml/sdtdatahash" xmlns:w16sdtfl="http://schemas.microsoft.com/office/word/2024/wordml/sdtformatlock" xmlns="" xmlns:o="urn:schemas-microsoft-com:office:office" xmlns:v="urn:schemas-microsoft-com:vml" xmlns:w10="urn:schemas-microsoft-com:office:word" xmlns:w="http://schemas.openxmlformats.org/wordprocessingml/2006/main" xmlns:a14="http://schemas.microsoft.com/office/drawing/2010/main" val="0"/>
+                              </a:ext>
+                            </a:extLst>
+                          </a:blip>
+                          <a:stretch>
+                            <a:fillRect/>
+                          </a:stretch>
+                        </pic:blipFill>
+                        <pic:spPr>
+                          <a:xfrm>
+                            <a:off x="0" y="0"/>
+                            <a:ext cx="7659370" cy="4541520"/>
+                          </a:xfrm>
+                          <a:prstGeom prst="rect">
+                            <a:avLst/>
+                          </a:prstGeom>
+                          <a:effectLst>
+                            <a:softEdge rad="203200"/>
+                          </a:effectLst>
+                        </pic:spPr>
+                      </pic:pic>
+                    </a:graphicData>
+                  </a:graphic>
+                  <wp14:sizeRelH relativeFrom="margin">
+                    <wp14:pctWidth>0</wp14:pctWidth>
+                  </wp14:sizeRelH>
+                  <wp14:sizeRelV relativeFrom="margin">
+                    <wp14:pctHeight>0</wp14:pctHeight>
+                  </wp14:sizeRelV>
+                </wp:anchor>
+              </w:drawing>
+            </w:r>
+            <w:r>
+              <w:t>{{item.desc}}</w:t>
+            </w:r>
+          </w:p>
+        </w:tc>
+        <w:tc>
+          <w:tcPr>
+            <w:tcW w:w="709" w:type="dxa"/>
+          </w:tcPr>
+          <w:p>
+            <w:pPr>
+              <w:cnfStyle w:val="000000100000" w:firstRow="0" w:lastRow="0" w:firstColumn="0" w:lastColumn="0" w:oddVBand="0" w:evenVBand="0" w:oddHBand="1" w:evenHBand="0" w:firstRowFirstColumn="0" w:firstRowLastColumn="0" w:lastRowFirstColumn="0" w:lastRowLastColumn="0"/>
+              <w:rPr>
+                <w:color w:val="000000" w:themeColor="text1"/>
+              </w:rPr>
+            </w:pPr>
+            <w:r>
+              <w:rPr>
+                <w:color w:val="000000" w:themeColor="text1"/>
+              </w:rPr>
+              <w:t>1 pcs.</w:t>
+            </w:r>
+          </w:p>
+        </w:tc>
+        <w:tc>
+          <w:tcPr>
+            <w:tcW w:w="1418" w:type="dxa"/>
+          </w:tcPr>
+          <w:p>
+            <w:pPr>
+              <w:cnfStyle w:val="000000100000" w:firstRow="0" w:lastRow="0" w:firstColumn="0" w:lastColumn="0" w:oddVBand="0" w:evenVBand="0" w:oddHBand="1" w:evenHBand="0" w:firstRowFirstColumn="0" w:firstRowLastColumn="0" w:lastRowFirstColumn="0" w:lastRowLastColumn="0"/>
+              <w:rPr>
+                <w:color w:val="000000" w:themeColor="text1"/>
+              </w:rPr>
+            </w:pPr>
+            <w:r>
+              <w:t>{{item.precio}}</w:t>
+            </w:r>
+          </w:p>
+        </w:tc>
+        <w:tc>
+          <w:tcPr>
+            <w:tcW w:w="2976" w:type="dxa"/>
+          </w:tcPr>
+          <w:p>
+            <w:pPr>
+              <w:cnfStyle w:val="000000100000" w:firstRow="0" w:lastRow="0" w:firstColumn="0" w:lastColumn="0" w:oddVBand="0" w:evenVBand="0" w:oddHBand="1" w:evenHBand="0" w:firstRowFirstColumn="0" w:firstRowLastColumn="0" w:lastRowFirstColumn="0" w:lastRowLastColumn="0"/>
+              <w:rPr>
+                <w:color w:val="000000" w:themeColor="text1"/>
               </w:rPr>
             </w:pPr>
             <w:r>
@@ -1486,29 +1496,37 @@
         </w:tc>
         <w:tc>
           <w:tcPr>
-            <w:tcW w:w="1134" w:type="dxa"/>
+            <w:tcW w:w="1985" w:type="dxa"/>
           </w:tcPr>
           <w:p>
             <w:pPr>
               <w:cnfStyle w:val="000000100000" w:firstRow="0" w:lastRow="0" w:firstColumn="0" w:lastColumn="0" w:oddVBand="0" w:evenVBand="0" w:oddHBand="1" w:evenHBand="0" w:firstRowFirstColumn="0" w:firstRowLastColumn="0" w:lastRowFirstColumn="0" w:lastRowLastColumn="0"/>
               <w:rPr>
                 <w:color w:val="000000" w:themeColor="text1"/>
+                <w:szCs w:val="16"/>
               </w:rPr>
             </w:pPr>
             <w:r>
               <w:rPr>
                 <w:rStyle w:val="CdigoHTML"/>
                 <w:rFonts w:eastAsiaTheme="minorEastAsia"/>
+                <w:sz w:val="16"/>
+                <w:szCs w:val="16"/>
               </w:rPr>
               <w:t>{{item.importe}}</w:t>
             </w:r>
             <w:r>
+              <w:rPr>
+                <w:szCs w:val="16"/>
+              </w:rPr>
               <w:t xml:space="preserve"> </w:t>
             </w:r>
             <w:r>
               <w:rPr>
                 <w:rStyle w:val="CdigoHTML"/>
                 <w:rFonts w:eastAsiaTheme="minorEastAsia"/>
+                <w:sz w:val="16"/>
+                <w:szCs w:val="16"/>
               </w:rPr>
               <w:t>{% tr endfor %}</w:t>
             </w:r>
@@ -1839,7 +1857,7 @@
                             <a:alphaModFix amt="35000"/>
                             <a:extLst>
                               <a:ext uri="">
-                                <a14:useLocalDpi xmlns:a14="http://schemas.microsoft.com/office/drawing/2010/main" xmlns:w="http://schemas.openxmlformats.org/wordprocessingml/2006/main" xmlns:w10="urn:schemas-microsoft-com:office:word" xmlns:v="urn:schemas-microsoft-com:vml" xmlns:o="urn:schemas-microsoft-com:office:office" xmlns="" xmlns:w16sdtfl="http://schemas.microsoft.com/office/word/2024/wordml/sdtformatlock" xmlns:w16sdtdh="http://schemas.microsoft.com/office/word/2020/wordml/sdtdatahash" xmlns:w16du="http://schemas.microsoft.com/office/word/2023/wordml/word16du" xmlns:w16="http://schemas.microsoft.com/office/word/2018/wordml" xmlns:w16cid="http://schemas.microsoft.com/office/word/2016/wordml/cid" xmlns:w16cex="http://schemas.microsoft.com/office/word/2018/wordml/cex" xmlns:oel="http://schemas.microsoft.com/office/2019/extlst" xmlns:am3d="http://schemas.microsoft.com/office/drawing/2017/model3d" xmlns:aink="http://schemas.microsoft.com/office/drawing/2016/ink" xmlns:cx8="http://schemas.microsoft.com/office/drawing/2016/5/14/chartex" xmlns:cx7="http://schemas.microsoft.com/office/drawing/2016/5/13/chartex" xmlns:cx6="http://schemas.microsoft.com/office/drawing/2016/5/12/chartex" xmlns:cx5="http://schemas.microsoft.com/office/drawing/2016/5/11/chartex" xmlns:cx4="http://schemas.microsoft.com/office/drawing/2016/5/10/chartex" xmlns:cx3="http://schemas.microsoft.com/office/drawing/2016/5/9/chartex" xmlns:cx2="http://schemas.microsoft.com/office/drawing/2015/10/21/chartex" xmlns:cx1="http://schemas.microsoft.com/office/drawing/2015/9/8/chartex" val="0"/>
+                                <a14:useLocalDpi xmlns:cx1="http://schemas.microsoft.com/office/drawing/2015/9/8/chartex" xmlns:cx2="http://schemas.microsoft.com/office/drawing/2015/10/21/chartex" xmlns:cx3="http://schemas.microsoft.com/office/drawing/2016/5/9/chartex" xmlns:cx4="http://schemas.microsoft.com/office/drawing/2016/5/10/chartex" xmlns:cx5="http://schemas.microsoft.com/office/drawing/2016/5/11/chartex" xmlns:cx6="http://schemas.microsoft.com/office/drawing/2016/5/12/chartex" xmlns:cx7="http://schemas.microsoft.com/office/drawing/2016/5/13/chartex" xmlns:cx8="http://schemas.microsoft.com/office/drawing/2016/5/14/chartex" xmlns:aink="http://schemas.microsoft.com/office/drawing/2016/ink" xmlns:am3d="http://schemas.microsoft.com/office/drawing/2017/model3d" xmlns:oel="http://schemas.microsoft.com/office/2019/extlst" xmlns:w16cex="http://schemas.microsoft.com/office/word/2018/wordml/cex" xmlns:w16cid="http://schemas.microsoft.com/office/word/2016/wordml/cid" xmlns:w16="http://schemas.microsoft.com/office/word/2018/wordml" xmlns:w16du="http://schemas.microsoft.com/office/word/2023/wordml/word16du" xmlns:w16sdtdh="http://schemas.microsoft.com/office/word/2020/wordml/sdtdatahash" xmlns:w16sdtfl="http://schemas.microsoft.com/office/word/2024/wordml/sdtformatlock" xmlns="" xmlns:o="urn:schemas-microsoft-com:office:office" xmlns:v="urn:schemas-microsoft-com:vml" xmlns:w10="urn:schemas-microsoft-com:office:word" xmlns:w="http://schemas.openxmlformats.org/wordprocessingml/2006/main" xmlns:a14="http://schemas.microsoft.com/office/drawing/2010/main" val="0"/>
                               </a:ext>
                             </a:extLst>
                           </a:blip>
@@ -1932,7 +1950,7 @@
                     </wp:anchor>
                   </w:drawing>
                 </mc:Choice>
-                <mc:Fallback xmlns:w16sdtfl="http://schemas.microsoft.com/office/word/2024/wordml/sdtformatlock" xmlns:w16sdtdh="http://schemas.microsoft.com/office/word/2020/wordml/sdtdatahash" xmlns:w16du="http://schemas.microsoft.com/office/word/2023/wordml/word16du" xmlns:w16="http://schemas.microsoft.com/office/word/2018/wordml" xmlns:w16cid="http://schemas.microsoft.com/office/word/2016/wordml/cid" xmlns:w16cex="http://schemas.microsoft.com/office/word/2018/wordml/cex" xmlns:oel="http://schemas.microsoft.com/office/2019/extlst" xmlns:am3d="http://schemas.microsoft.com/office/drawing/2017/model3d" xmlns:aink="http://schemas.microsoft.com/office/drawing/2016/ink" xmlns:cx8="http://schemas.microsoft.com/office/drawing/2016/5/14/chartex" xmlns:cx7="http://schemas.microsoft.com/office/drawing/2016/5/13/chartex" xmlns:cx6="http://schemas.microsoft.com/office/drawing/2016/5/12/chartex" xmlns:cx5="http://schemas.microsoft.com/office/drawing/2016/5/11/chartex" xmlns:cx4="http://schemas.microsoft.com/office/drawing/2016/5/10/chartex" xmlns:cx3="http://schemas.microsoft.com/office/drawing/2016/5/9/chartex" xmlns:cx2="http://schemas.microsoft.com/office/drawing/2015/10/21/chartex" xmlns:cx1="http://schemas.microsoft.com/office/drawing/2015/9/8/chartex">
+                <mc:Fallback xmlns:cx1="http://schemas.microsoft.com/office/drawing/2015/9/8/chartex" xmlns:cx2="http://schemas.microsoft.com/office/drawing/2015/10/21/chartex" xmlns:cx3="http://schemas.microsoft.com/office/drawing/2016/5/9/chartex" xmlns:cx4="http://schemas.microsoft.com/office/drawing/2016/5/10/chartex" xmlns:cx5="http://schemas.microsoft.com/office/drawing/2016/5/11/chartex" xmlns:cx6="http://schemas.microsoft.com/office/drawing/2016/5/12/chartex" xmlns:cx7="http://schemas.microsoft.com/office/drawing/2016/5/13/chartex" xmlns:cx8="http://schemas.microsoft.com/office/drawing/2016/5/14/chartex" xmlns:aink="http://schemas.microsoft.com/office/drawing/2016/ink" xmlns:am3d="http://schemas.microsoft.com/office/drawing/2017/model3d" xmlns:oel="http://schemas.microsoft.com/office/2019/extlst" xmlns:w16cex="http://schemas.microsoft.com/office/word/2018/wordml/cex" xmlns:w16cid="http://schemas.microsoft.com/office/word/2016/wordml/cid" xmlns:w16="http://schemas.microsoft.com/office/word/2018/wordml" xmlns:w16du="http://schemas.microsoft.com/office/word/2023/wordml/word16du" xmlns:w16sdtdh="http://schemas.microsoft.com/office/word/2020/wordml/sdtdatahash" xmlns:w16sdtfl="http://schemas.microsoft.com/office/word/2024/wordml/sdtformatlock">
                   <w:pict>
                     <v:line w14:anchorId="22A5DB73" id="Conector recto 9" o:spid="_x0000_s1026" style="position:absolute;z-index:251676672;visibility:visible;mso-wrap-style:square;mso-width-percent:0;mso-height-percent:0;mso-wrap-distance-left:9pt;mso-wrap-distance-top:0;mso-wrap-distance-right:9pt;mso-wrap-distance-bottom:0;mso-position-horizontal:absolute;mso-position-horizontal-relative:text;mso-position-vertical:absolute;mso-position-vertical-relative:text;mso-width-percent:0;mso-height-percent:0;mso-width-relative:margin;mso-height-relative:margin" from="332.05pt,86.85pt" to="467.65pt,86.85pt" o:gfxdata="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" strokecolor="black [3040]"/>
                   </w:pict>
@@ -3615,6 +3633,7 @@
   <w:style w:type="character" w:default="1" w:styleId="Fuentedeprrafopredeter">
     <w:name w:val="Default Paragraph Font"/>
     <w:uiPriority w:val="1"/>
+    <w:semiHidden/>
     <w:unhideWhenUsed/>
   </w:style>
   <w:style w:type="table" w:default="1" w:styleId="Tablanormal">
@@ -4887,6 +4906,26 @@
 </file>
 
 <file path=customXml/item1.xml><?xml version="1.0" encoding="utf-8"?>
+<p:properties xmlns:p="http://schemas.microsoft.com/office/2006/metadata/properties" xmlns:xsi="http://www.w3.org/2001/XMLSchema-instance" xmlns:pc="http://schemas.microsoft.com/office/infopath/2007/PartnerControls">
+  <documentManagement>
+    <_ip_UnifiedCompliancePolicyUIAction xmlns="http://schemas.microsoft.com/sharepoint/v3" xsi:nil="true"/>
+    <Image xmlns="71af3243-3dd4-4a8d-8c0d-dd76da1f02a5">
+      <Url xsi:nil="true"/>
+      <Description xsi:nil="true"/>
+    </Image>
+    <Status xmlns="71af3243-3dd4-4a8d-8c0d-dd76da1f02a5">Not started</Status>
+    <Background xmlns="71af3243-3dd4-4a8d-8c0d-dd76da1f02a5">false</Background>
+    <_ip_UnifiedCompliancePolicyProperties xmlns="http://schemas.microsoft.com/sharepoint/v3" xsi:nil="true"/>
+    <ImageTagsTaxHTField xmlns="71af3243-3dd4-4a8d-8c0d-dd76da1f02a5">
+      <Terms xmlns="http://schemas.microsoft.com/office/infopath/2007/PartnerControls"/>
+    </ImageTagsTaxHTField>
+    <TaxCatchAll xmlns="230e9df3-be65-4c73-a93b-d1236ebd677e" xsi:nil="true"/>
+    <MediaServiceKeyPoints xmlns="71af3243-3dd4-4a8d-8c0d-dd76da1f02a5" xsi:nil="true"/>
+  </documentManagement>
+</p:properties>
+</file>
+
+<file path=customXml/item2.xml><?xml version="1.0" encoding="utf-8"?>
 <ct:contentTypeSchema xmlns:ct="http://schemas.microsoft.com/office/2006/metadata/contentType" xmlns:ma="http://schemas.microsoft.com/office/2006/metadata/properties/metaAttributes" ct:_="" ma:_="" ma:contentTypeName="Document" ma:contentTypeID="0x01010079F111ED35F8CC479449609E8A0923A6" ma:contentTypeVersion="26" ma:contentTypeDescription="Create a new document." ma:contentTypeScope="" ma:versionID="ac37c1753acd5e330d2062ccec26ea66">
   <xsd:schema xmlns:xsd="http://www.w3.org/2001/XMLSchema" xmlns:xs="http://www.w3.org/2001/XMLSchema" xmlns:p="http://schemas.microsoft.com/office/2006/metadata/properties" xmlns:ns1="http://schemas.microsoft.com/sharepoint/v3" xmlns:ns2="71af3243-3dd4-4a8d-8c0d-dd76da1f02a5" xmlns:ns3="16c05727-aa75-4e4a-9b5f-8a80a1165891" xmlns:ns4="230e9df3-be65-4c73-a93b-d1236ebd677e" targetNamespace="http://schemas.microsoft.com/office/2006/metadata/properties" ma:root="true" ma:fieldsID="3b340c7101c92c5120abd06486f94548" ns1:_="" ns2:_="" ns3:_="" ns4:_="">
     <xsd:import namespace="http://schemas.microsoft.com/sharepoint/v3"/>
@@ -5186,26 +5225,6 @@
 </ct:contentTypeSchema>
 </file>
 
-<file path=customXml/item2.xml><?xml version="1.0" encoding="utf-8"?>
-<p:properties xmlns:p="http://schemas.microsoft.com/office/2006/metadata/properties" xmlns:xsi="http://www.w3.org/2001/XMLSchema-instance" xmlns:pc="http://schemas.microsoft.com/office/infopath/2007/PartnerControls">
-  <documentManagement>
-    <_ip_UnifiedCompliancePolicyUIAction xmlns="http://schemas.microsoft.com/sharepoint/v3" xsi:nil="true"/>
-    <Image xmlns="71af3243-3dd4-4a8d-8c0d-dd76da1f02a5">
-      <Url xsi:nil="true"/>
-      <Description xsi:nil="true"/>
-    </Image>
-    <Status xmlns="71af3243-3dd4-4a8d-8c0d-dd76da1f02a5">Not started</Status>
-    <Background xmlns="71af3243-3dd4-4a8d-8c0d-dd76da1f02a5">false</Background>
-    <_ip_UnifiedCompliancePolicyProperties xmlns="http://schemas.microsoft.com/sharepoint/v3" xsi:nil="true"/>
-    <ImageTagsTaxHTField xmlns="71af3243-3dd4-4a8d-8c0d-dd76da1f02a5">
-      <Terms xmlns="http://schemas.microsoft.com/office/infopath/2007/PartnerControls"/>
-    </ImageTagsTaxHTField>
-    <TaxCatchAll xmlns="230e9df3-be65-4c73-a93b-d1236ebd677e" xsi:nil="true"/>
-    <MediaServiceKeyPoints xmlns="71af3243-3dd4-4a8d-8c0d-dd76da1f02a5" xsi:nil="true"/>
-  </documentManagement>
-</p:properties>
-</file>
-
 <file path=customXml/item3.xml><?xml version="1.0" encoding="utf-8"?>
 <?mso-contentType ?>
 <FormTemplates xmlns="http://schemas.microsoft.com/sharepoint/v3/contenttype/forms">
@@ -5220,6 +5239,18 @@
 </file>
 
 <file path=customXml/itemProps1.xml><?xml version="1.0" encoding="utf-8"?>
+<ds:datastoreItem xmlns:ds="http://schemas.openxmlformats.org/officeDocument/2006/customXml" ds:itemID="{D189125E-F545-46E5-B780-871CAFC26324}">
+  <ds:schemaRefs>
+    <ds:schemaRef ds:uri="http://schemas.microsoft.com/office/2006/metadata/properties"/>
+    <ds:schemaRef ds:uri="http://schemas.microsoft.com/office/infopath/2007/PartnerControls"/>
+    <ds:schemaRef ds:uri="http://schemas.microsoft.com/sharepoint/v3"/>
+    <ds:schemaRef ds:uri="71af3243-3dd4-4a8d-8c0d-dd76da1f02a5"/>
+    <ds:schemaRef ds:uri="230e9df3-be65-4c73-a93b-d1236ebd677e"/>
+  </ds:schemaRefs>
+</ds:datastoreItem>
+</file>
+
+<file path=customXml/itemProps2.xml><?xml version="1.0" encoding="utf-8"?>
 <ds:datastoreItem xmlns:ds="http://schemas.openxmlformats.org/officeDocument/2006/customXml" ds:itemID="{33CF9CD8-197E-44B2-AC01-616EC0F8C03F}">
   <ds:schemaRefs>
     <ds:schemaRef ds:uri="http://schemas.microsoft.com/office/2006/metadata/contentType"/>
@@ -5240,18 +5271,6 @@
 </ds:datastoreItem>
 </file>
 
-<file path=customXml/itemProps2.xml><?xml version="1.0" encoding="utf-8"?>
-<ds:datastoreItem xmlns:ds="http://schemas.openxmlformats.org/officeDocument/2006/customXml" ds:itemID="{D189125E-F545-46E5-B780-871CAFC26324}">
-  <ds:schemaRefs>
-    <ds:schemaRef ds:uri="http://schemas.microsoft.com/office/2006/metadata/properties"/>
-    <ds:schemaRef ds:uri="http://schemas.microsoft.com/office/infopath/2007/PartnerControls"/>
-    <ds:schemaRef ds:uri="http://schemas.microsoft.com/sharepoint/v3"/>
-    <ds:schemaRef ds:uri="71af3243-3dd4-4a8d-8c0d-dd76da1f02a5"/>
-    <ds:schemaRef ds:uri="230e9df3-be65-4c73-a93b-d1236ebd677e"/>
-  </ds:schemaRefs>
-</ds:datastoreItem>
-</file>
-
 <file path=customXml/itemProps3.xml><?xml version="1.0" encoding="utf-8"?>
 <ds:datastoreItem xmlns:ds="http://schemas.openxmlformats.org/officeDocument/2006/customXml" ds:itemID="{0FBE260B-89FA-4C2A-8CC6-AF410096B44F}">
   <ds:schemaRefs>
@@ -5261,7 +5280,7 @@
 </file>
 
 <file path=customXml/itemProps4.xml><?xml version="1.0" encoding="utf-8"?>
-<ds:datastoreItem xmlns:ds="http://schemas.openxmlformats.org/officeDocument/2006/customXml" ds:itemID="{4E2059C5-5E57-4674-8641-107E885A164B}">
+<ds:datastoreItem xmlns:ds="http://schemas.openxmlformats.org/officeDocument/2006/customXml" ds:itemID="{170D9C76-AF42-4579-A2C0-ACBA8EADCD65}">
   <ds:schemaRefs>
     <ds:schemaRef ds:uri="http://schemas.openxmlformats.org/officeDocument/2006/bibliography"/>
   </ds:schemaRefs>

</xml_diff>

<commit_message>
Borrando el maldito punto de la cotizacion
</commit_message>
<xml_diff>
--- a/plantilla_int.docx
+++ b/plantilla_int.docx
@@ -1222,7 +1222,18 @@
                 <w:sz w:val="18"/>
                 <w:lang w:val="es-AR"/>
               </w:rPr>
-              <w:t>{{cotiz.}}</w:t>
+              <w:t>{{cotiz</w:t>
+            </w:r>
+            <w:bookmarkStart w:id="0" w:name="_GoBack"/>
+            <w:bookmarkEnd w:id="0"/>
+            <w:r>
+              <w:rPr>
+                <w:rFonts w:ascii="Arial" w:eastAsia="Arial" w:hAnsi="Arial" w:cs="Arial"/>
+                <w:noProof/>
+                <w:sz w:val="18"/>
+                <w:lang w:val="es-AR"/>
+              </w:rPr>
+              <w:t>}}</w:t>
             </w:r>
           </w:p>
         </w:tc>
@@ -1274,8 +1285,8 @@
             <w:pPr>
               <w:widowControl w:val="0"/>
             </w:pPr>
-            <w:bookmarkStart w:id="0" w:name="__DdeLink__139_614838437"/>
-            <w:bookmarkEnd w:id="0"/>
+            <w:bookmarkStart w:id="1" w:name="__DdeLink__139_614838437"/>
+            <w:bookmarkEnd w:id="1"/>
           </w:p>
         </w:tc>
       </w:tr>
@@ -1929,8 +1940,6 @@
           <w:color w:val="000000" w:themeColor="text1"/>
         </w:rPr>
       </w:pPr>
-      <w:bookmarkStart w:id="1" w:name="_GoBack"/>
-      <w:bookmarkEnd w:id="1"/>
     </w:p>
     <w:tbl>
       <w:tblPr>
@@ -5429,7 +5438,7 @@
 </file>
 
 <file path=customXml/itemProps4.xml><?xml version="1.0" encoding="utf-8"?>
-<ds:datastoreItem xmlns:ds="http://schemas.openxmlformats.org/officeDocument/2006/customXml" ds:itemID="{8B7BA9AF-02B3-4392-9B7B-C27017B5500C}">
+<ds:datastoreItem xmlns:ds="http://schemas.openxmlformats.org/officeDocument/2006/customXml" ds:itemID="{8353D1E9-E004-48F6-B904-DC663D830C8F}">
   <ds:schemaRefs>
     <ds:schemaRef ds:uri="http://schemas.openxmlformats.org/officeDocument/2006/bibliography"/>
   </ds:schemaRefs>

</xml_diff>

<commit_message>
Usando etiqueta for nativa a prueba de fallos
</commit_message>
<xml_diff>
--- a/plantilla_int.docx
+++ b/plantilla_int.docx
@@ -646,7 +646,7 @@
                     </wp:anchor>
                   </w:drawing>
                 </mc:Choice>
-                <mc:Fallback xmlns:cx1="http://schemas.microsoft.com/office/drawing/2015/9/8/chartex" xmlns:cx2="http://schemas.microsoft.com/office/drawing/2015/10/21/chartex" xmlns:cx3="http://schemas.microsoft.com/office/drawing/2016/5/9/chartex" xmlns:cx4="http://schemas.microsoft.com/office/drawing/2016/5/10/chartex" xmlns:cx5="http://schemas.microsoft.com/office/drawing/2016/5/11/chartex" xmlns:cx6="http://schemas.microsoft.com/office/drawing/2016/5/12/chartex" xmlns:cx7="http://schemas.microsoft.com/office/drawing/2016/5/13/chartex" xmlns:cx8="http://schemas.microsoft.com/office/drawing/2016/5/14/chartex" xmlns:aink="http://schemas.microsoft.com/office/drawing/2016/ink" xmlns:am3d="http://schemas.microsoft.com/office/drawing/2017/model3d" xmlns:oel="http://schemas.microsoft.com/office/2019/extlst" xmlns:w16cex="http://schemas.microsoft.com/office/word/2018/wordml/cex" xmlns:w16cid="http://schemas.microsoft.com/office/word/2016/wordml/cid" xmlns:w16="http://schemas.microsoft.com/office/word/2018/wordml" xmlns:w16du="http://schemas.microsoft.com/office/word/2023/wordml/word16du" xmlns:w16sdtdh="http://schemas.microsoft.com/office/word/2020/wordml/sdtdatahash" xmlns:w16sdtfl="http://schemas.microsoft.com/office/word/2024/wordml/sdtformatlock">
+                <mc:Fallback xmlns:w16sdtfl="http://schemas.microsoft.com/office/word/2024/wordml/sdtformatlock" xmlns:w16sdtdh="http://schemas.microsoft.com/office/word/2020/wordml/sdtdatahash" xmlns:w16du="http://schemas.microsoft.com/office/word/2023/wordml/word16du" xmlns:w16="http://schemas.microsoft.com/office/word/2018/wordml" xmlns:w16cid="http://schemas.microsoft.com/office/word/2016/wordml/cid" xmlns:w16cex="http://schemas.microsoft.com/office/word/2018/wordml/cex" xmlns:oel="http://schemas.microsoft.com/office/2019/extlst" xmlns:am3d="http://schemas.microsoft.com/office/drawing/2017/model3d" xmlns:aink="http://schemas.microsoft.com/office/drawing/2016/ink" xmlns:cx8="http://schemas.microsoft.com/office/drawing/2016/5/14/chartex" xmlns:cx7="http://schemas.microsoft.com/office/drawing/2016/5/13/chartex" xmlns:cx6="http://schemas.microsoft.com/office/drawing/2016/5/12/chartex" xmlns:cx5="http://schemas.microsoft.com/office/drawing/2016/5/11/chartex" xmlns:cx4="http://schemas.microsoft.com/office/drawing/2016/5/10/chartex" xmlns:cx3="http://schemas.microsoft.com/office/drawing/2016/5/9/chartex" xmlns:cx2="http://schemas.microsoft.com/office/drawing/2015/10/21/chartex" xmlns:cx1="http://schemas.microsoft.com/office/drawing/2015/9/8/chartex">
                   <w:pict>
                     <v:line w14:anchorId="4C297CA5" id="Conector recto 6" o:spid="_x0000_s1026" style="position:absolute;flip:y;z-index:251670528;visibility:visible;mso-wrap-style:square;mso-wrap-distance-left:9pt;mso-wrap-distance-top:0;mso-wrap-distance-right:9pt;mso-wrap-distance-bottom:0;mso-position-horizontal:absolute;mso-position-horizontal-relative:text;mso-position-vertical:absolute;mso-position-vertical-relative:text" from="-47.5pt,8.85pt" to="508.7pt,11.25pt" o:gfxdata="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" strokecolor="black [3040]"/>
                   </w:pict>
@@ -1044,7 +1044,6 @@
                 <w:color w:val="FFFFFF" w:themeColor="background1"/>
               </w:rPr>
             </w:pPr>
-            <w:bookmarkStart w:id="0" w:name="_GoBack"/>
             <w:r>
               <w:rPr>
                 <w:color w:val="FFFFFF" w:themeColor="background1"/>
@@ -1158,7 +1157,6 @@
           </w:p>
         </w:tc>
       </w:tr>
-      <w:bookmarkEnd w:id="0"/>
       <w:tr>
         <w:trPr>
           <w:trHeight w:val="314"/>
@@ -1282,8 +1280,8 @@
             <w:pPr>
               <w:widowControl w:val="0"/>
             </w:pPr>
-            <w:bookmarkStart w:id="1" w:name="__DdeLink__139_614838437"/>
-            <w:bookmarkEnd w:id="1"/>
+            <w:bookmarkStart w:id="0" w:name="__DdeLink__139_614838437"/>
+            <w:bookmarkEnd w:id="0"/>
           </w:p>
         </w:tc>
       </w:tr>
@@ -1423,7 +1421,18 @@
                 <w:sz w:val="16"/>
                 <w:szCs w:val="16"/>
               </w:rPr>
-              <w:t>{% tr for item in productos %} {{item.nombre}}</w:t>
+              <w:t>{%</w:t>
+            </w:r>
+            <w:r>
+              <w:rPr>
+                <w:rStyle w:val="CdigoHTML"/>
+                <w:rFonts w:ascii="Arial" w:eastAsiaTheme="minorEastAsia" w:hAnsi="Arial" w:cs="Arial"/>
+                <w:b w:val="0"/>
+                <w:noProof/>
+                <w:sz w:val="16"/>
+                <w:szCs w:val="16"/>
+              </w:rPr>
+              <w:t xml:space="preserve"> for item in productos %} {{item.nombre}}</w:t>
             </w:r>
           </w:p>
         </w:tc>
@@ -1549,7 +1558,17 @@
                 <w:sz w:val="16"/>
                 <w:szCs w:val="16"/>
               </w:rPr>
-              <w:t>{{item.importe}} {% tr endfor %}</w:t>
+              <w:t xml:space="preserve">{{item.importe}} {% </w:t>
+            </w:r>
+            <w:r>
+              <w:rPr>
+                <w:rStyle w:val="CdigoHTML"/>
+                <w:rFonts w:ascii="Arial" w:eastAsiaTheme="minorEastAsia" w:hAnsi="Arial" w:cs="Arial"/>
+                <w:noProof/>
+                <w:sz w:val="16"/>
+                <w:szCs w:val="16"/>
+              </w:rPr>
+              <w:t>endfor %}</w:t>
             </w:r>
           </w:p>
         </w:tc>
@@ -1834,6 +1853,8 @@
           <w:color w:val="000000" w:themeColor="text1"/>
         </w:rPr>
       </w:pPr>
+      <w:bookmarkStart w:id="1" w:name="_GoBack"/>
+      <w:bookmarkEnd w:id="1"/>
     </w:p>
     <w:tbl>
       <w:tblPr>
@@ -1903,7 +1924,7 @@
                             <a:alphaModFix amt="35000"/>
                             <a:extLst>
                               <a:ext uri="">
-                                <a14:useLocalDpi xmlns:cx1="http://schemas.microsoft.com/office/drawing/2015/9/8/chartex" xmlns:cx2="http://schemas.microsoft.com/office/drawing/2015/10/21/chartex" xmlns:cx3="http://schemas.microsoft.com/office/drawing/2016/5/9/chartex" xmlns:cx4="http://schemas.microsoft.com/office/drawing/2016/5/10/chartex" xmlns:cx5="http://schemas.microsoft.com/office/drawing/2016/5/11/chartex" xmlns:cx6="http://schemas.microsoft.com/office/drawing/2016/5/12/chartex" xmlns:cx7="http://schemas.microsoft.com/office/drawing/2016/5/13/chartex" xmlns:cx8="http://schemas.microsoft.com/office/drawing/2016/5/14/chartex" xmlns:aink="http://schemas.microsoft.com/office/drawing/2016/ink" xmlns:am3d="http://schemas.microsoft.com/office/drawing/2017/model3d" xmlns:oel="http://schemas.microsoft.com/office/2019/extlst" xmlns:w16cex="http://schemas.microsoft.com/office/word/2018/wordml/cex" xmlns:w16cid="http://schemas.microsoft.com/office/word/2016/wordml/cid" xmlns:w16="http://schemas.microsoft.com/office/word/2018/wordml" xmlns:w16du="http://schemas.microsoft.com/office/word/2023/wordml/word16du" xmlns:w16sdtdh="http://schemas.microsoft.com/office/word/2020/wordml/sdtdatahash" xmlns:w16sdtfl="http://schemas.microsoft.com/office/word/2024/wordml/sdtformatlock" xmlns="" xmlns:o="urn:schemas-microsoft-com:office:office" xmlns:v="urn:schemas-microsoft-com:vml" xmlns:w10="urn:schemas-microsoft-com:office:word" xmlns:w="http://schemas.openxmlformats.org/wordprocessingml/2006/main" xmlns:a14="http://schemas.microsoft.com/office/drawing/2010/main" val="0"/>
+                                <a14:useLocalDpi xmlns:a14="http://schemas.microsoft.com/office/drawing/2010/main" xmlns:w="http://schemas.openxmlformats.org/wordprocessingml/2006/main" xmlns:w10="urn:schemas-microsoft-com:office:word" xmlns:v="urn:schemas-microsoft-com:vml" xmlns:o="urn:schemas-microsoft-com:office:office" xmlns="" xmlns:w16sdtfl="http://schemas.microsoft.com/office/word/2024/wordml/sdtformatlock" xmlns:w16sdtdh="http://schemas.microsoft.com/office/word/2020/wordml/sdtdatahash" xmlns:w16du="http://schemas.microsoft.com/office/word/2023/wordml/word16du" xmlns:w16="http://schemas.microsoft.com/office/word/2018/wordml" xmlns:w16cid="http://schemas.microsoft.com/office/word/2016/wordml/cid" xmlns:w16cex="http://schemas.microsoft.com/office/word/2018/wordml/cex" xmlns:oel="http://schemas.microsoft.com/office/2019/extlst" xmlns:am3d="http://schemas.microsoft.com/office/drawing/2017/model3d" xmlns:aink="http://schemas.microsoft.com/office/drawing/2016/ink" xmlns:cx8="http://schemas.microsoft.com/office/drawing/2016/5/14/chartex" xmlns:cx7="http://schemas.microsoft.com/office/drawing/2016/5/13/chartex" xmlns:cx6="http://schemas.microsoft.com/office/drawing/2016/5/12/chartex" xmlns:cx5="http://schemas.microsoft.com/office/drawing/2016/5/11/chartex" xmlns:cx4="http://schemas.microsoft.com/office/drawing/2016/5/10/chartex" xmlns:cx3="http://schemas.microsoft.com/office/drawing/2016/5/9/chartex" xmlns:cx2="http://schemas.microsoft.com/office/drawing/2015/10/21/chartex" xmlns:cx1="http://schemas.microsoft.com/office/drawing/2015/9/8/chartex" val="0"/>
                               </a:ext>
                             </a:extLst>
                           </a:blip>
@@ -1996,7 +2017,7 @@
                     </wp:anchor>
                   </w:drawing>
                 </mc:Choice>
-                <mc:Fallback xmlns:cx1="http://schemas.microsoft.com/office/drawing/2015/9/8/chartex" xmlns:cx2="http://schemas.microsoft.com/office/drawing/2015/10/21/chartex" xmlns:cx3="http://schemas.microsoft.com/office/drawing/2016/5/9/chartex" xmlns:cx4="http://schemas.microsoft.com/office/drawing/2016/5/10/chartex" xmlns:cx5="http://schemas.microsoft.com/office/drawing/2016/5/11/chartex" xmlns:cx6="http://schemas.microsoft.com/office/drawing/2016/5/12/chartex" xmlns:cx7="http://schemas.microsoft.com/office/drawing/2016/5/13/chartex" xmlns:cx8="http://schemas.microsoft.com/office/drawing/2016/5/14/chartex" xmlns:aink="http://schemas.microsoft.com/office/drawing/2016/ink" xmlns:am3d="http://schemas.microsoft.com/office/drawing/2017/model3d" xmlns:oel="http://schemas.microsoft.com/office/2019/extlst" xmlns:w16cex="http://schemas.microsoft.com/office/word/2018/wordml/cex" xmlns:w16cid="http://schemas.microsoft.com/office/word/2016/wordml/cid" xmlns:w16="http://schemas.microsoft.com/office/word/2018/wordml" xmlns:w16du="http://schemas.microsoft.com/office/word/2023/wordml/word16du" xmlns:w16sdtdh="http://schemas.microsoft.com/office/word/2020/wordml/sdtdatahash" xmlns:w16sdtfl="http://schemas.microsoft.com/office/word/2024/wordml/sdtformatlock">
+                <mc:Fallback xmlns:w16sdtfl="http://schemas.microsoft.com/office/word/2024/wordml/sdtformatlock" xmlns:w16sdtdh="http://schemas.microsoft.com/office/word/2020/wordml/sdtdatahash" xmlns:w16du="http://schemas.microsoft.com/office/word/2023/wordml/word16du" xmlns:w16="http://schemas.microsoft.com/office/word/2018/wordml" xmlns:w16cid="http://schemas.microsoft.com/office/word/2016/wordml/cid" xmlns:w16cex="http://schemas.microsoft.com/office/word/2018/wordml/cex" xmlns:oel="http://schemas.microsoft.com/office/2019/extlst" xmlns:am3d="http://schemas.microsoft.com/office/drawing/2017/model3d" xmlns:aink="http://schemas.microsoft.com/office/drawing/2016/ink" xmlns:cx8="http://schemas.microsoft.com/office/drawing/2016/5/14/chartex" xmlns:cx7="http://schemas.microsoft.com/office/drawing/2016/5/13/chartex" xmlns:cx6="http://schemas.microsoft.com/office/drawing/2016/5/12/chartex" xmlns:cx5="http://schemas.microsoft.com/office/drawing/2016/5/11/chartex" xmlns:cx4="http://schemas.microsoft.com/office/drawing/2016/5/10/chartex" xmlns:cx3="http://schemas.microsoft.com/office/drawing/2016/5/9/chartex" xmlns:cx2="http://schemas.microsoft.com/office/drawing/2015/10/21/chartex" xmlns:cx1="http://schemas.microsoft.com/office/drawing/2015/9/8/chartex">
                   <w:pict>
                     <v:line w14:anchorId="22A5DB73" id="Conector recto 9" o:spid="_x0000_s1026" style="position:absolute;z-index:251676672;visibility:visible;mso-wrap-style:square;mso-width-percent:0;mso-height-percent:0;mso-wrap-distance-left:9pt;mso-wrap-distance-top:0;mso-wrap-distance-right:9pt;mso-wrap-distance-bottom:0;mso-position-horizontal:absolute;mso-position-horizontal-relative:text;mso-position-vertical:absolute;mso-position-vertical-relative:text;mso-width-percent:0;mso-height-percent:0;mso-width-relative:margin;mso-height-relative:margin" from="332.05pt,86.85pt" to="467.65pt,86.85pt" o:gfxdata="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" strokecolor="black [3040]"/>
                   </w:pict>
@@ -4958,26 +4979,6 @@
 </file>
 
 <file path=customXml/item1.xml><?xml version="1.0" encoding="utf-8"?>
-<p:properties xmlns:p="http://schemas.microsoft.com/office/2006/metadata/properties" xmlns:xsi="http://www.w3.org/2001/XMLSchema-instance" xmlns:pc="http://schemas.microsoft.com/office/infopath/2007/PartnerControls">
-  <documentManagement>
-    <_ip_UnifiedCompliancePolicyUIAction xmlns="http://schemas.microsoft.com/sharepoint/v3" xsi:nil="true"/>
-    <Image xmlns="71af3243-3dd4-4a8d-8c0d-dd76da1f02a5">
-      <Url xsi:nil="true"/>
-      <Description xsi:nil="true"/>
-    </Image>
-    <Status xmlns="71af3243-3dd4-4a8d-8c0d-dd76da1f02a5">Not started</Status>
-    <Background xmlns="71af3243-3dd4-4a8d-8c0d-dd76da1f02a5">false</Background>
-    <_ip_UnifiedCompliancePolicyProperties xmlns="http://schemas.microsoft.com/sharepoint/v3" xsi:nil="true"/>
-    <ImageTagsTaxHTField xmlns="71af3243-3dd4-4a8d-8c0d-dd76da1f02a5">
-      <Terms xmlns="http://schemas.microsoft.com/office/infopath/2007/PartnerControls"/>
-    </ImageTagsTaxHTField>
-    <TaxCatchAll xmlns="230e9df3-be65-4c73-a93b-d1236ebd677e" xsi:nil="true"/>
-    <MediaServiceKeyPoints xmlns="71af3243-3dd4-4a8d-8c0d-dd76da1f02a5" xsi:nil="true"/>
-  </documentManagement>
-</p:properties>
-</file>
-
-<file path=customXml/item2.xml><?xml version="1.0" encoding="utf-8"?>
 <ct:contentTypeSchema xmlns:ct="http://schemas.microsoft.com/office/2006/metadata/contentType" xmlns:ma="http://schemas.microsoft.com/office/2006/metadata/properties/metaAttributes" ct:_="" ma:_="" ma:contentTypeName="Document" ma:contentTypeID="0x01010079F111ED35F8CC479449609E8A0923A6" ma:contentTypeVersion="26" ma:contentTypeDescription="Create a new document." ma:contentTypeScope="" ma:versionID="ac37c1753acd5e330d2062ccec26ea66">
   <xsd:schema xmlns:xsd="http://www.w3.org/2001/XMLSchema" xmlns:xs="http://www.w3.org/2001/XMLSchema" xmlns:p="http://schemas.microsoft.com/office/2006/metadata/properties" xmlns:ns1="http://schemas.microsoft.com/sharepoint/v3" xmlns:ns2="71af3243-3dd4-4a8d-8c0d-dd76da1f02a5" xmlns:ns3="16c05727-aa75-4e4a-9b5f-8a80a1165891" xmlns:ns4="230e9df3-be65-4c73-a93b-d1236ebd677e" targetNamespace="http://schemas.microsoft.com/office/2006/metadata/properties" ma:root="true" ma:fieldsID="3b340c7101c92c5120abd06486f94548" ns1:_="" ns2:_="" ns3:_="" ns4:_="">
     <xsd:import namespace="http://schemas.microsoft.com/sharepoint/v3"/>
@@ -5277,6 +5278,26 @@
 </ct:contentTypeSchema>
 </file>
 
+<file path=customXml/item2.xml><?xml version="1.0" encoding="utf-8"?>
+<p:properties xmlns:p="http://schemas.microsoft.com/office/2006/metadata/properties" xmlns:xsi="http://www.w3.org/2001/XMLSchema-instance" xmlns:pc="http://schemas.microsoft.com/office/infopath/2007/PartnerControls">
+  <documentManagement>
+    <_ip_UnifiedCompliancePolicyUIAction xmlns="http://schemas.microsoft.com/sharepoint/v3" xsi:nil="true"/>
+    <Image xmlns="71af3243-3dd4-4a8d-8c0d-dd76da1f02a5">
+      <Url xsi:nil="true"/>
+      <Description xsi:nil="true"/>
+    </Image>
+    <Status xmlns="71af3243-3dd4-4a8d-8c0d-dd76da1f02a5">Not started</Status>
+    <Background xmlns="71af3243-3dd4-4a8d-8c0d-dd76da1f02a5">false</Background>
+    <_ip_UnifiedCompliancePolicyProperties xmlns="http://schemas.microsoft.com/sharepoint/v3" xsi:nil="true"/>
+    <ImageTagsTaxHTField xmlns="71af3243-3dd4-4a8d-8c0d-dd76da1f02a5">
+      <Terms xmlns="http://schemas.microsoft.com/office/infopath/2007/PartnerControls"/>
+    </ImageTagsTaxHTField>
+    <TaxCatchAll xmlns="230e9df3-be65-4c73-a93b-d1236ebd677e" xsi:nil="true"/>
+    <MediaServiceKeyPoints xmlns="71af3243-3dd4-4a8d-8c0d-dd76da1f02a5" xsi:nil="true"/>
+  </documentManagement>
+</p:properties>
+</file>
+
 <file path=customXml/item3.xml><?xml version="1.0" encoding="utf-8"?>
 <?mso-contentType ?>
 <FormTemplates xmlns="http://schemas.microsoft.com/sharepoint/v3/contenttype/forms">
@@ -5291,18 +5312,6 @@
 </file>
 
 <file path=customXml/itemProps1.xml><?xml version="1.0" encoding="utf-8"?>
-<ds:datastoreItem xmlns:ds="http://schemas.openxmlformats.org/officeDocument/2006/customXml" ds:itemID="{D189125E-F545-46E5-B780-871CAFC26324}">
-  <ds:schemaRefs>
-    <ds:schemaRef ds:uri="http://schemas.microsoft.com/office/2006/metadata/properties"/>
-    <ds:schemaRef ds:uri="http://schemas.microsoft.com/office/infopath/2007/PartnerControls"/>
-    <ds:schemaRef ds:uri="http://schemas.microsoft.com/sharepoint/v3"/>
-    <ds:schemaRef ds:uri="71af3243-3dd4-4a8d-8c0d-dd76da1f02a5"/>
-    <ds:schemaRef ds:uri="230e9df3-be65-4c73-a93b-d1236ebd677e"/>
-  </ds:schemaRefs>
-</ds:datastoreItem>
-</file>
-
-<file path=customXml/itemProps2.xml><?xml version="1.0" encoding="utf-8"?>
 <ds:datastoreItem xmlns:ds="http://schemas.openxmlformats.org/officeDocument/2006/customXml" ds:itemID="{33CF9CD8-197E-44B2-AC01-616EC0F8C03F}">
   <ds:schemaRefs>
     <ds:schemaRef ds:uri="http://schemas.microsoft.com/office/2006/metadata/contentType"/>
@@ -5323,6 +5332,18 @@
 </ds:datastoreItem>
 </file>
 
+<file path=customXml/itemProps2.xml><?xml version="1.0" encoding="utf-8"?>
+<ds:datastoreItem xmlns:ds="http://schemas.openxmlformats.org/officeDocument/2006/customXml" ds:itemID="{D189125E-F545-46E5-B780-871CAFC26324}">
+  <ds:schemaRefs>
+    <ds:schemaRef ds:uri="http://schemas.microsoft.com/office/2006/metadata/properties"/>
+    <ds:schemaRef ds:uri="http://schemas.microsoft.com/office/infopath/2007/PartnerControls"/>
+    <ds:schemaRef ds:uri="http://schemas.microsoft.com/sharepoint/v3"/>
+    <ds:schemaRef ds:uri="71af3243-3dd4-4a8d-8c0d-dd76da1f02a5"/>
+    <ds:schemaRef ds:uri="230e9df3-be65-4c73-a93b-d1236ebd677e"/>
+  </ds:schemaRefs>
+</ds:datastoreItem>
+</file>
+
 <file path=customXml/itemProps3.xml><?xml version="1.0" encoding="utf-8"?>
 <ds:datastoreItem xmlns:ds="http://schemas.openxmlformats.org/officeDocument/2006/customXml" ds:itemID="{0FBE260B-89FA-4C2A-8CC6-AF410096B44F}">
   <ds:schemaRefs>
@@ -5332,7 +5353,7 @@
 </file>
 
 <file path=customXml/itemProps4.xml><?xml version="1.0" encoding="utf-8"?>
-<ds:datastoreItem xmlns:ds="http://schemas.openxmlformats.org/officeDocument/2006/customXml" ds:itemID="{2830644F-AAB7-4E68-AFA6-D27C83162FF1}">
+<ds:datastoreItem xmlns:ds="http://schemas.openxmlformats.org/officeDocument/2006/customXml" ds:itemID="{15DAB341-F0DD-43F3-AC34-BA90308659FE}">
   <ds:schemaRefs>
     <ds:schemaRef ds:uri="http://schemas.openxmlformats.org/officeDocument/2006/bibliography"/>
   </ds:schemaRefs>

</xml_diff>

<commit_message>
Corrigiendo columnas y restaurando el tr en minúscula
</commit_message>
<xml_diff>
--- a/plantilla_int.docx
+++ b/plantilla_int.docx
@@ -646,7 +646,7 @@
                     </wp:anchor>
                   </w:drawing>
                 </mc:Choice>
-                <mc:Fallback xmlns:w16sdtfl="http://schemas.microsoft.com/office/word/2024/wordml/sdtformatlock" xmlns:w16sdtdh="http://schemas.microsoft.com/office/word/2020/wordml/sdtdatahash" xmlns:w16du="http://schemas.microsoft.com/office/word/2023/wordml/word16du" xmlns:w16="http://schemas.microsoft.com/office/word/2018/wordml" xmlns:w16cid="http://schemas.microsoft.com/office/word/2016/wordml/cid" xmlns:w16cex="http://schemas.microsoft.com/office/word/2018/wordml/cex" xmlns:oel="http://schemas.microsoft.com/office/2019/extlst" xmlns:am3d="http://schemas.microsoft.com/office/drawing/2017/model3d" xmlns:aink="http://schemas.microsoft.com/office/drawing/2016/ink" xmlns:cx8="http://schemas.microsoft.com/office/drawing/2016/5/14/chartex" xmlns:cx7="http://schemas.microsoft.com/office/drawing/2016/5/13/chartex" xmlns:cx6="http://schemas.microsoft.com/office/drawing/2016/5/12/chartex" xmlns:cx5="http://schemas.microsoft.com/office/drawing/2016/5/11/chartex" xmlns:cx4="http://schemas.microsoft.com/office/drawing/2016/5/10/chartex" xmlns:cx3="http://schemas.microsoft.com/office/drawing/2016/5/9/chartex" xmlns:cx2="http://schemas.microsoft.com/office/drawing/2015/10/21/chartex" xmlns:cx1="http://schemas.microsoft.com/office/drawing/2015/9/8/chartex">
+                <mc:Fallback xmlns:cx1="http://schemas.microsoft.com/office/drawing/2015/9/8/chartex" xmlns:cx2="http://schemas.microsoft.com/office/drawing/2015/10/21/chartex" xmlns:cx3="http://schemas.microsoft.com/office/drawing/2016/5/9/chartex" xmlns:cx4="http://schemas.microsoft.com/office/drawing/2016/5/10/chartex" xmlns:cx5="http://schemas.microsoft.com/office/drawing/2016/5/11/chartex" xmlns:cx6="http://schemas.microsoft.com/office/drawing/2016/5/12/chartex" xmlns:cx7="http://schemas.microsoft.com/office/drawing/2016/5/13/chartex" xmlns:cx8="http://schemas.microsoft.com/office/drawing/2016/5/14/chartex" xmlns:aink="http://schemas.microsoft.com/office/drawing/2016/ink" xmlns:am3d="http://schemas.microsoft.com/office/drawing/2017/model3d" xmlns:oel="http://schemas.microsoft.com/office/2019/extlst" xmlns:w16cex="http://schemas.microsoft.com/office/word/2018/wordml/cex" xmlns:w16cid="http://schemas.microsoft.com/office/word/2016/wordml/cid" xmlns:w16="http://schemas.microsoft.com/office/word/2018/wordml" xmlns:w16du="http://schemas.microsoft.com/office/word/2023/wordml/word16du" xmlns:w16sdtdh="http://schemas.microsoft.com/office/word/2020/wordml/sdtdatahash" xmlns:w16sdtfl="http://schemas.microsoft.com/office/word/2024/wordml/sdtformatlock">
                   <w:pict>
                     <v:line w14:anchorId="4C297CA5" id="Conector recto 6" o:spid="_x0000_s1026" style="position:absolute;flip:y;z-index:251670528;visibility:visible;mso-wrap-style:square;mso-wrap-distance-left:9pt;mso-wrap-distance-top:0;mso-wrap-distance-right:9pt;mso-wrap-distance-bottom:0;mso-position-horizontal:absolute;mso-position-horizontal-relative:text;mso-position-vertical:absolute;mso-position-vertical-relative:text" from="-47.5pt,8.85pt" to="508.7pt,11.25pt" o:gfxdata="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" strokecolor="black [3040]"/>
                   </w:pict>
@@ -1296,7 +1296,7 @@
     <w:tbl>
       <w:tblPr>
         <w:tblStyle w:val="Tabladecuadrcula4-nfasis4"/>
-        <w:tblW w:w="10060" w:type="dxa"/>
+        <w:tblW w:w="0" w:type="auto"/>
         <w:tblLayout w:type="fixed"/>
         <w:tblLook w:val="04A0" w:firstRow="1" w:lastRow="0" w:firstColumn="1" w:lastColumn="0" w:noHBand="0" w:noVBand="1"/>
       </w:tblPr>
@@ -1432,6 +1432,17 @@
                 <w:sz w:val="16"/>
                 <w:szCs w:val="16"/>
               </w:rPr>
+              <w:t xml:space="preserve"> tr</w:t>
+            </w:r>
+            <w:r>
+              <w:rPr>
+                <w:rStyle w:val="CdigoHTML"/>
+                <w:rFonts w:ascii="Arial" w:eastAsiaTheme="minorEastAsia" w:hAnsi="Arial" w:cs="Arial"/>
+                <w:b w:val="0"/>
+                <w:noProof/>
+                <w:sz w:val="16"/>
+                <w:szCs w:val="16"/>
+              </w:rPr>
               <w:t xml:space="preserve"> for item in productos %} {{item.nombre}}</w:t>
             </w:r>
           </w:p>
@@ -1558,7 +1569,27 @@
                 <w:sz w:val="16"/>
                 <w:szCs w:val="16"/>
               </w:rPr>
-              <w:t xml:space="preserve">{{item.importe}} {% </w:t>
+              <w:t>{{item.importe}} {%</w:t>
+            </w:r>
+            <w:r>
+              <w:rPr>
+                <w:rStyle w:val="CdigoHTML"/>
+                <w:rFonts w:ascii="Arial" w:eastAsiaTheme="minorEastAsia" w:hAnsi="Arial" w:cs="Arial"/>
+                <w:noProof/>
+                <w:sz w:val="16"/>
+                <w:szCs w:val="16"/>
+              </w:rPr>
+              <w:t xml:space="preserve"> tr</w:t>
+            </w:r>
+            <w:r>
+              <w:rPr>
+                <w:rStyle w:val="CdigoHTML"/>
+                <w:rFonts w:ascii="Arial" w:eastAsiaTheme="minorEastAsia" w:hAnsi="Arial" w:cs="Arial"/>
+                <w:noProof/>
+                <w:sz w:val="16"/>
+                <w:szCs w:val="16"/>
+              </w:rPr>
+              <w:t xml:space="preserve"> </w:t>
             </w:r>
             <w:r>
               <w:rPr>
@@ -1924,7 +1955,7 @@
                             <a:alphaModFix amt="35000"/>
                             <a:extLst>
                               <a:ext uri="">
-                                <a14:useLocalDpi xmlns:a14="http://schemas.microsoft.com/office/drawing/2010/main" xmlns:w="http://schemas.openxmlformats.org/wordprocessingml/2006/main" xmlns:w10="urn:schemas-microsoft-com:office:word" xmlns:v="urn:schemas-microsoft-com:vml" xmlns:o="urn:schemas-microsoft-com:office:office" xmlns="" xmlns:w16sdtfl="http://schemas.microsoft.com/office/word/2024/wordml/sdtformatlock" xmlns:w16sdtdh="http://schemas.microsoft.com/office/word/2020/wordml/sdtdatahash" xmlns:w16du="http://schemas.microsoft.com/office/word/2023/wordml/word16du" xmlns:w16="http://schemas.microsoft.com/office/word/2018/wordml" xmlns:w16cid="http://schemas.microsoft.com/office/word/2016/wordml/cid" xmlns:w16cex="http://schemas.microsoft.com/office/word/2018/wordml/cex" xmlns:oel="http://schemas.microsoft.com/office/2019/extlst" xmlns:am3d="http://schemas.microsoft.com/office/drawing/2017/model3d" xmlns:aink="http://schemas.microsoft.com/office/drawing/2016/ink" xmlns:cx8="http://schemas.microsoft.com/office/drawing/2016/5/14/chartex" xmlns:cx7="http://schemas.microsoft.com/office/drawing/2016/5/13/chartex" xmlns:cx6="http://schemas.microsoft.com/office/drawing/2016/5/12/chartex" xmlns:cx5="http://schemas.microsoft.com/office/drawing/2016/5/11/chartex" xmlns:cx4="http://schemas.microsoft.com/office/drawing/2016/5/10/chartex" xmlns:cx3="http://schemas.microsoft.com/office/drawing/2016/5/9/chartex" xmlns:cx2="http://schemas.microsoft.com/office/drawing/2015/10/21/chartex" xmlns:cx1="http://schemas.microsoft.com/office/drawing/2015/9/8/chartex" val="0"/>
+                                <a14:useLocalDpi xmlns:cx1="http://schemas.microsoft.com/office/drawing/2015/9/8/chartex" xmlns:cx2="http://schemas.microsoft.com/office/drawing/2015/10/21/chartex" xmlns:cx3="http://schemas.microsoft.com/office/drawing/2016/5/9/chartex" xmlns:cx4="http://schemas.microsoft.com/office/drawing/2016/5/10/chartex" xmlns:cx5="http://schemas.microsoft.com/office/drawing/2016/5/11/chartex" xmlns:cx6="http://schemas.microsoft.com/office/drawing/2016/5/12/chartex" xmlns:cx7="http://schemas.microsoft.com/office/drawing/2016/5/13/chartex" xmlns:cx8="http://schemas.microsoft.com/office/drawing/2016/5/14/chartex" xmlns:aink="http://schemas.microsoft.com/office/drawing/2016/ink" xmlns:am3d="http://schemas.microsoft.com/office/drawing/2017/model3d" xmlns:oel="http://schemas.microsoft.com/office/2019/extlst" xmlns:w16cex="http://schemas.microsoft.com/office/word/2018/wordml/cex" xmlns:w16cid="http://schemas.microsoft.com/office/word/2016/wordml/cid" xmlns:w16="http://schemas.microsoft.com/office/word/2018/wordml" xmlns:w16du="http://schemas.microsoft.com/office/word/2023/wordml/word16du" xmlns:w16sdtdh="http://schemas.microsoft.com/office/word/2020/wordml/sdtdatahash" xmlns:w16sdtfl="http://schemas.microsoft.com/office/word/2024/wordml/sdtformatlock" xmlns="" xmlns:o="urn:schemas-microsoft-com:office:office" xmlns:v="urn:schemas-microsoft-com:vml" xmlns:w10="urn:schemas-microsoft-com:office:word" xmlns:w="http://schemas.openxmlformats.org/wordprocessingml/2006/main" xmlns:a14="http://schemas.microsoft.com/office/drawing/2010/main" val="0"/>
                               </a:ext>
                             </a:extLst>
                           </a:blip>
@@ -2017,7 +2048,7 @@
                     </wp:anchor>
                   </w:drawing>
                 </mc:Choice>
-                <mc:Fallback xmlns:w16sdtfl="http://schemas.microsoft.com/office/word/2024/wordml/sdtformatlock" xmlns:w16sdtdh="http://schemas.microsoft.com/office/word/2020/wordml/sdtdatahash" xmlns:w16du="http://schemas.microsoft.com/office/word/2023/wordml/word16du" xmlns:w16="http://schemas.microsoft.com/office/word/2018/wordml" xmlns:w16cid="http://schemas.microsoft.com/office/word/2016/wordml/cid" xmlns:w16cex="http://schemas.microsoft.com/office/word/2018/wordml/cex" xmlns:oel="http://schemas.microsoft.com/office/2019/extlst" xmlns:am3d="http://schemas.microsoft.com/office/drawing/2017/model3d" xmlns:aink="http://schemas.microsoft.com/office/drawing/2016/ink" xmlns:cx8="http://schemas.microsoft.com/office/drawing/2016/5/14/chartex" xmlns:cx7="http://schemas.microsoft.com/office/drawing/2016/5/13/chartex" xmlns:cx6="http://schemas.microsoft.com/office/drawing/2016/5/12/chartex" xmlns:cx5="http://schemas.microsoft.com/office/drawing/2016/5/11/chartex" xmlns:cx4="http://schemas.microsoft.com/office/drawing/2016/5/10/chartex" xmlns:cx3="http://schemas.microsoft.com/office/drawing/2016/5/9/chartex" xmlns:cx2="http://schemas.microsoft.com/office/drawing/2015/10/21/chartex" xmlns:cx1="http://schemas.microsoft.com/office/drawing/2015/9/8/chartex">
+                <mc:Fallback xmlns:cx1="http://schemas.microsoft.com/office/drawing/2015/9/8/chartex" xmlns:cx2="http://schemas.microsoft.com/office/drawing/2015/10/21/chartex" xmlns:cx3="http://schemas.microsoft.com/office/drawing/2016/5/9/chartex" xmlns:cx4="http://schemas.microsoft.com/office/drawing/2016/5/10/chartex" xmlns:cx5="http://schemas.microsoft.com/office/drawing/2016/5/11/chartex" xmlns:cx6="http://schemas.microsoft.com/office/drawing/2016/5/12/chartex" xmlns:cx7="http://schemas.microsoft.com/office/drawing/2016/5/13/chartex" xmlns:cx8="http://schemas.microsoft.com/office/drawing/2016/5/14/chartex" xmlns:aink="http://schemas.microsoft.com/office/drawing/2016/ink" xmlns:am3d="http://schemas.microsoft.com/office/drawing/2017/model3d" xmlns:oel="http://schemas.microsoft.com/office/2019/extlst" xmlns:w16cex="http://schemas.microsoft.com/office/word/2018/wordml/cex" xmlns:w16cid="http://schemas.microsoft.com/office/word/2016/wordml/cid" xmlns:w16="http://schemas.microsoft.com/office/word/2018/wordml" xmlns:w16du="http://schemas.microsoft.com/office/word/2023/wordml/word16du" xmlns:w16sdtdh="http://schemas.microsoft.com/office/word/2020/wordml/sdtdatahash" xmlns:w16sdtfl="http://schemas.microsoft.com/office/word/2024/wordml/sdtformatlock">
                   <w:pict>
                     <v:line w14:anchorId="22A5DB73" id="Conector recto 9" o:spid="_x0000_s1026" style="position:absolute;z-index:251676672;visibility:visible;mso-wrap-style:square;mso-width-percent:0;mso-height-percent:0;mso-wrap-distance-left:9pt;mso-wrap-distance-top:0;mso-wrap-distance-right:9pt;mso-wrap-distance-bottom:0;mso-position-horizontal:absolute;mso-position-horizontal-relative:text;mso-position-vertical:absolute;mso-position-vertical-relative:text;mso-width-percent:0;mso-height-percent:0;mso-width-relative:margin;mso-height-relative:margin" from="332.05pt,86.85pt" to="467.65pt,86.85pt" o:gfxdata="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" strokecolor="black [3040]"/>
                   </w:pict>
@@ -4979,6 +5010,26 @@
 </file>
 
 <file path=customXml/item1.xml><?xml version="1.0" encoding="utf-8"?>
+<p:properties xmlns:p="http://schemas.microsoft.com/office/2006/metadata/properties" xmlns:xsi="http://www.w3.org/2001/XMLSchema-instance" xmlns:pc="http://schemas.microsoft.com/office/infopath/2007/PartnerControls">
+  <documentManagement>
+    <_ip_UnifiedCompliancePolicyUIAction xmlns="http://schemas.microsoft.com/sharepoint/v3" xsi:nil="true"/>
+    <Image xmlns="71af3243-3dd4-4a8d-8c0d-dd76da1f02a5">
+      <Url xsi:nil="true"/>
+      <Description xsi:nil="true"/>
+    </Image>
+    <Status xmlns="71af3243-3dd4-4a8d-8c0d-dd76da1f02a5">Not started</Status>
+    <Background xmlns="71af3243-3dd4-4a8d-8c0d-dd76da1f02a5">false</Background>
+    <_ip_UnifiedCompliancePolicyProperties xmlns="http://schemas.microsoft.com/sharepoint/v3" xsi:nil="true"/>
+    <ImageTagsTaxHTField xmlns="71af3243-3dd4-4a8d-8c0d-dd76da1f02a5">
+      <Terms xmlns="http://schemas.microsoft.com/office/infopath/2007/PartnerControls"/>
+    </ImageTagsTaxHTField>
+    <TaxCatchAll xmlns="230e9df3-be65-4c73-a93b-d1236ebd677e" xsi:nil="true"/>
+    <MediaServiceKeyPoints xmlns="71af3243-3dd4-4a8d-8c0d-dd76da1f02a5" xsi:nil="true"/>
+  </documentManagement>
+</p:properties>
+</file>
+
+<file path=customXml/item2.xml><?xml version="1.0" encoding="utf-8"?>
 <ct:contentTypeSchema xmlns:ct="http://schemas.microsoft.com/office/2006/metadata/contentType" xmlns:ma="http://schemas.microsoft.com/office/2006/metadata/properties/metaAttributes" ct:_="" ma:_="" ma:contentTypeName="Document" ma:contentTypeID="0x01010079F111ED35F8CC479449609E8A0923A6" ma:contentTypeVersion="26" ma:contentTypeDescription="Create a new document." ma:contentTypeScope="" ma:versionID="ac37c1753acd5e330d2062ccec26ea66">
   <xsd:schema xmlns:xsd="http://www.w3.org/2001/XMLSchema" xmlns:xs="http://www.w3.org/2001/XMLSchema" xmlns:p="http://schemas.microsoft.com/office/2006/metadata/properties" xmlns:ns1="http://schemas.microsoft.com/sharepoint/v3" xmlns:ns2="71af3243-3dd4-4a8d-8c0d-dd76da1f02a5" xmlns:ns3="16c05727-aa75-4e4a-9b5f-8a80a1165891" xmlns:ns4="230e9df3-be65-4c73-a93b-d1236ebd677e" targetNamespace="http://schemas.microsoft.com/office/2006/metadata/properties" ma:root="true" ma:fieldsID="3b340c7101c92c5120abd06486f94548" ns1:_="" ns2:_="" ns3:_="" ns4:_="">
     <xsd:import namespace="http://schemas.microsoft.com/sharepoint/v3"/>
@@ -5278,26 +5329,6 @@
 </ct:contentTypeSchema>
 </file>
 
-<file path=customXml/item2.xml><?xml version="1.0" encoding="utf-8"?>
-<p:properties xmlns:p="http://schemas.microsoft.com/office/2006/metadata/properties" xmlns:xsi="http://www.w3.org/2001/XMLSchema-instance" xmlns:pc="http://schemas.microsoft.com/office/infopath/2007/PartnerControls">
-  <documentManagement>
-    <_ip_UnifiedCompliancePolicyUIAction xmlns="http://schemas.microsoft.com/sharepoint/v3" xsi:nil="true"/>
-    <Image xmlns="71af3243-3dd4-4a8d-8c0d-dd76da1f02a5">
-      <Url xsi:nil="true"/>
-      <Description xsi:nil="true"/>
-    </Image>
-    <Status xmlns="71af3243-3dd4-4a8d-8c0d-dd76da1f02a5">Not started</Status>
-    <Background xmlns="71af3243-3dd4-4a8d-8c0d-dd76da1f02a5">false</Background>
-    <_ip_UnifiedCompliancePolicyProperties xmlns="http://schemas.microsoft.com/sharepoint/v3" xsi:nil="true"/>
-    <ImageTagsTaxHTField xmlns="71af3243-3dd4-4a8d-8c0d-dd76da1f02a5">
-      <Terms xmlns="http://schemas.microsoft.com/office/infopath/2007/PartnerControls"/>
-    </ImageTagsTaxHTField>
-    <TaxCatchAll xmlns="230e9df3-be65-4c73-a93b-d1236ebd677e" xsi:nil="true"/>
-    <MediaServiceKeyPoints xmlns="71af3243-3dd4-4a8d-8c0d-dd76da1f02a5" xsi:nil="true"/>
-  </documentManagement>
-</p:properties>
-</file>
-
 <file path=customXml/item3.xml><?xml version="1.0" encoding="utf-8"?>
 <?mso-contentType ?>
 <FormTemplates xmlns="http://schemas.microsoft.com/sharepoint/v3/contenttype/forms">
@@ -5312,6 +5343,18 @@
 </file>
 
 <file path=customXml/itemProps1.xml><?xml version="1.0" encoding="utf-8"?>
+<ds:datastoreItem xmlns:ds="http://schemas.openxmlformats.org/officeDocument/2006/customXml" ds:itemID="{D189125E-F545-46E5-B780-871CAFC26324}">
+  <ds:schemaRefs>
+    <ds:schemaRef ds:uri="http://schemas.microsoft.com/office/2006/metadata/properties"/>
+    <ds:schemaRef ds:uri="http://schemas.microsoft.com/office/infopath/2007/PartnerControls"/>
+    <ds:schemaRef ds:uri="http://schemas.microsoft.com/sharepoint/v3"/>
+    <ds:schemaRef ds:uri="71af3243-3dd4-4a8d-8c0d-dd76da1f02a5"/>
+    <ds:schemaRef ds:uri="230e9df3-be65-4c73-a93b-d1236ebd677e"/>
+  </ds:schemaRefs>
+</ds:datastoreItem>
+</file>
+
+<file path=customXml/itemProps2.xml><?xml version="1.0" encoding="utf-8"?>
 <ds:datastoreItem xmlns:ds="http://schemas.openxmlformats.org/officeDocument/2006/customXml" ds:itemID="{33CF9CD8-197E-44B2-AC01-616EC0F8C03F}">
   <ds:schemaRefs>
     <ds:schemaRef ds:uri="http://schemas.microsoft.com/office/2006/metadata/contentType"/>
@@ -5332,18 +5375,6 @@
 </ds:datastoreItem>
 </file>
 
-<file path=customXml/itemProps2.xml><?xml version="1.0" encoding="utf-8"?>
-<ds:datastoreItem xmlns:ds="http://schemas.openxmlformats.org/officeDocument/2006/customXml" ds:itemID="{D189125E-F545-46E5-B780-871CAFC26324}">
-  <ds:schemaRefs>
-    <ds:schemaRef ds:uri="http://schemas.microsoft.com/office/2006/metadata/properties"/>
-    <ds:schemaRef ds:uri="http://schemas.microsoft.com/office/infopath/2007/PartnerControls"/>
-    <ds:schemaRef ds:uri="http://schemas.microsoft.com/sharepoint/v3"/>
-    <ds:schemaRef ds:uri="71af3243-3dd4-4a8d-8c0d-dd76da1f02a5"/>
-    <ds:schemaRef ds:uri="230e9df3-be65-4c73-a93b-d1236ebd677e"/>
-  </ds:schemaRefs>
-</ds:datastoreItem>
-</file>
-
 <file path=customXml/itemProps3.xml><?xml version="1.0" encoding="utf-8"?>
 <ds:datastoreItem xmlns:ds="http://schemas.openxmlformats.org/officeDocument/2006/customXml" ds:itemID="{0FBE260B-89FA-4C2A-8CC6-AF410096B44F}">
   <ds:schemaRefs>
@@ -5353,7 +5384,7 @@
 </file>
 
 <file path=customXml/itemProps4.xml><?xml version="1.0" encoding="utf-8"?>
-<ds:datastoreItem xmlns:ds="http://schemas.openxmlformats.org/officeDocument/2006/customXml" ds:itemID="{15DAB341-F0DD-43F3-AC34-BA90308659FE}">
+<ds:datastoreItem xmlns:ds="http://schemas.openxmlformats.org/officeDocument/2006/customXml" ds:itemID="{D717344F-00B3-429D-8EB0-9FF2A849F283}">
   <ds:schemaRefs>
     <ds:schemaRef ds:uri="http://schemas.openxmlformats.org/officeDocument/2006/bibliography"/>
   </ds:schemaRefs>

</xml_diff>

<commit_message>
Ajuste de ancho de columnas
</commit_message>
<xml_diff>
--- a/plantilla_int.docx
+++ b/plantilla_int.docx
@@ -646,7 +646,7 @@
                     </wp:anchor>
                   </w:drawing>
                 </mc:Choice>
-                <mc:Fallback xmlns:cx1="http://schemas.microsoft.com/office/drawing/2015/9/8/chartex" xmlns:cx2="http://schemas.microsoft.com/office/drawing/2015/10/21/chartex" xmlns:cx3="http://schemas.microsoft.com/office/drawing/2016/5/9/chartex" xmlns:cx4="http://schemas.microsoft.com/office/drawing/2016/5/10/chartex" xmlns:cx5="http://schemas.microsoft.com/office/drawing/2016/5/11/chartex" xmlns:cx6="http://schemas.microsoft.com/office/drawing/2016/5/12/chartex" xmlns:cx7="http://schemas.microsoft.com/office/drawing/2016/5/13/chartex" xmlns:cx8="http://schemas.microsoft.com/office/drawing/2016/5/14/chartex" xmlns:aink="http://schemas.microsoft.com/office/drawing/2016/ink" xmlns:am3d="http://schemas.microsoft.com/office/drawing/2017/model3d" xmlns:oel="http://schemas.microsoft.com/office/2019/extlst" xmlns:w16cex="http://schemas.microsoft.com/office/word/2018/wordml/cex" xmlns:w16cid="http://schemas.microsoft.com/office/word/2016/wordml/cid" xmlns:w16="http://schemas.microsoft.com/office/word/2018/wordml" xmlns:w16du="http://schemas.microsoft.com/office/word/2023/wordml/word16du" xmlns:w16sdtdh="http://schemas.microsoft.com/office/word/2020/wordml/sdtdatahash" xmlns:w16sdtfl="http://schemas.microsoft.com/office/word/2024/wordml/sdtformatlock">
+                <mc:Fallback xmlns:w16sdtfl="http://schemas.microsoft.com/office/word/2024/wordml/sdtformatlock" xmlns:w16sdtdh="http://schemas.microsoft.com/office/word/2020/wordml/sdtdatahash" xmlns:w16du="http://schemas.microsoft.com/office/word/2023/wordml/word16du" xmlns:w16="http://schemas.microsoft.com/office/word/2018/wordml" xmlns:w16cid="http://schemas.microsoft.com/office/word/2016/wordml/cid" xmlns:w16cex="http://schemas.microsoft.com/office/word/2018/wordml/cex" xmlns:oel="http://schemas.microsoft.com/office/2019/extlst" xmlns:am3d="http://schemas.microsoft.com/office/drawing/2017/model3d" xmlns:aink="http://schemas.microsoft.com/office/drawing/2016/ink" xmlns:cx8="http://schemas.microsoft.com/office/drawing/2016/5/14/chartex" xmlns:cx7="http://schemas.microsoft.com/office/drawing/2016/5/13/chartex" xmlns:cx6="http://schemas.microsoft.com/office/drawing/2016/5/12/chartex" xmlns:cx5="http://schemas.microsoft.com/office/drawing/2016/5/11/chartex" xmlns:cx4="http://schemas.microsoft.com/office/drawing/2016/5/10/chartex" xmlns:cx3="http://schemas.microsoft.com/office/drawing/2016/5/9/chartex" xmlns:cx2="http://schemas.microsoft.com/office/drawing/2015/10/21/chartex" xmlns:cx1="http://schemas.microsoft.com/office/drawing/2015/9/8/chartex">
                   <w:pict>
                     <v:line w14:anchorId="4C297CA5" id="Conector recto 6" o:spid="_x0000_s1026" style="position:absolute;flip:y;z-index:251670528;visibility:visible;mso-wrap-style:square;mso-wrap-distance-left:9pt;mso-wrap-distance-top:0;mso-wrap-distance-right:9pt;mso-wrap-distance-bottom:0;mso-position-horizontal:absolute;mso-position-horizontal-relative:text;mso-position-vertical:absolute;mso-position-vertical-relative:text" from="-47.5pt,8.85pt" to="508.7pt,11.25pt" o:gfxdata="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" strokecolor="black [3040]"/>
                   </w:pict>
@@ -1014,18 +1014,19 @@
     <w:tbl>
       <w:tblPr>
         <w:tblStyle w:val="Tabladecuadrcula4-nfasis4"/>
-        <w:tblW w:w="5022" w:type="pct"/>
+        <w:tblW w:w="5469" w:type="pct"/>
+        <w:tblInd w:w="-431" w:type="dxa"/>
         <w:tblLayout w:type="fixed"/>
         <w:tblLook w:val="0620" w:firstRow="1" w:lastRow="0" w:firstColumn="0" w:lastColumn="0" w:noHBand="1" w:noVBand="1"/>
         <w:tblDescription w:val="Escriba nombre del vendedor, puesto, condiciones de pago y fecha de vencimiento en esta tabla."/>
       </w:tblPr>
       <w:tblGrid>
-        <w:gridCol w:w="1413"/>
+        <w:gridCol w:w="1845"/>
         <w:gridCol w:w="1559"/>
         <w:gridCol w:w="1134"/>
         <w:gridCol w:w="992"/>
         <w:gridCol w:w="3119"/>
-        <w:gridCol w:w="1417"/>
+        <w:gridCol w:w="1843"/>
       </w:tblGrid>
       <w:tr>
         <w:trPr>
@@ -1034,7 +1035,7 @@
         </w:trPr>
         <w:tc>
           <w:tcPr>
-            <w:tcW w:w="1413" w:type="dxa"/>
+            <w:tcW w:w="1844" w:type="dxa"/>
           </w:tcPr>
           <w:p>
             <w:pPr>
@@ -1139,7 +1140,7 @@
         </w:tc>
         <w:tc>
           <w:tcPr>
-            <w:tcW w:w="1417" w:type="dxa"/>
+            <w:tcW w:w="1843" w:type="dxa"/>
           </w:tcPr>
           <w:p>
             <w:pPr>
@@ -1163,7 +1164,7 @@
         </w:trPr>
         <w:tc>
           <w:tcPr>
-            <w:tcW w:w="1413" w:type="dxa"/>
+            <w:tcW w:w="1844" w:type="dxa"/>
           </w:tcPr>
           <w:p>
             <w:pPr>
@@ -1274,7 +1275,7 @@
         </w:tc>
         <w:tc>
           <w:tcPr>
-            <w:tcW w:w="1417" w:type="dxa"/>
+            <w:tcW w:w="1843" w:type="dxa"/>
           </w:tcPr>
           <w:p>
             <w:pPr>
@@ -1296,18 +1297,21 @@
     <w:tbl>
       <w:tblPr>
         <w:tblStyle w:val="Tabladecuadrcula4-nfasis4"/>
-        <w:tblW w:w="0" w:type="auto"/>
+        <w:tblW w:w="10491" w:type="dxa"/>
+        <w:tblInd w:w="-431" w:type="dxa"/>
         <w:tblLayout w:type="fixed"/>
         <w:tblLook w:val="04A0" w:firstRow="1" w:lastRow="0" w:firstColumn="1" w:lastColumn="0" w:noHBand="0" w:noVBand="1"/>
       </w:tblPr>
       <w:tblGrid>
-        <w:gridCol w:w="2547"/>
-        <w:gridCol w:w="992"/>
+        <w:gridCol w:w="2694"/>
+        <w:gridCol w:w="1276"/>
+        <w:gridCol w:w="709"/>
+        <w:gridCol w:w="283"/>
+        <w:gridCol w:w="1134"/>
         <w:gridCol w:w="284"/>
-        <w:gridCol w:w="708"/>
         <w:gridCol w:w="1276"/>
-        <w:gridCol w:w="1559"/>
-        <w:gridCol w:w="2694"/>
+        <w:gridCol w:w="283"/>
+        <w:gridCol w:w="2552"/>
       </w:tblGrid>
       <w:tr>
         <w:trPr>
@@ -1316,7 +1320,7 @@
         <w:tc>
           <w:tcPr>
             <w:cnfStyle w:val="001000000000" w:firstRow="0" w:lastRow="0" w:firstColumn="1" w:lastColumn="0" w:oddVBand="0" w:evenVBand="0" w:oddHBand="0" w:evenHBand="0" w:firstRowFirstColumn="0" w:firstRowLastColumn="0" w:lastRowFirstColumn="0" w:lastRowLastColumn="0"/>
-            <w:tcW w:w="2547" w:type="dxa"/>
+            <w:tcW w:w="2694" w:type="dxa"/>
           </w:tcPr>
           <w:p>
             <w:r>
@@ -1326,7 +1330,7 @@
         </w:tc>
         <w:tc>
           <w:tcPr>
-            <w:tcW w:w="992" w:type="dxa"/>
+            <w:tcW w:w="1276" w:type="dxa"/>
           </w:tcPr>
           <w:p>
             <w:pPr>
@@ -1353,7 +1357,8 @@
         </w:tc>
         <w:tc>
           <w:tcPr>
-            <w:tcW w:w="1276" w:type="dxa"/>
+            <w:tcW w:w="1418" w:type="dxa"/>
+            <w:gridSpan w:val="2"/>
           </w:tcPr>
           <w:p>
             <w:pPr>
@@ -1368,6 +1373,7 @@
         <w:tc>
           <w:tcPr>
             <w:tcW w:w="1559" w:type="dxa"/>
+            <w:gridSpan w:val="2"/>
           </w:tcPr>
           <w:p>
             <w:pPr>
@@ -1380,7 +1386,7 @@
         </w:tc>
         <w:tc>
           <w:tcPr>
-            <w:tcW w:w="2694" w:type="dxa"/>
+            <w:tcW w:w="2552" w:type="dxa"/>
           </w:tcPr>
           <w:p>
             <w:pPr>
@@ -1400,103 +1406,19 @@
         <w:tc>
           <w:tcPr>
             <w:cnfStyle w:val="001000000000" w:firstRow="0" w:lastRow="0" w:firstColumn="1" w:lastColumn="0" w:oddVBand="0" w:evenVBand="0" w:oddHBand="0" w:evenHBand="0" w:firstRowFirstColumn="0" w:firstRowLastColumn="0" w:lastRowFirstColumn="0" w:lastRowLastColumn="0"/>
-            <w:tcW w:w="2547" w:type="dxa"/>
+            <w:tcW w:w="2694" w:type="dxa"/>
           </w:tcPr>
           <w:p>
             <w:pPr>
               <w:rPr>
-                <w:rFonts w:ascii="Arial" w:hAnsi="Arial" w:cs="Arial"/>
-                <w:b w:val="0"/>
                 <w:noProof/>
-                <w:color w:val="000000" w:themeColor="text1"/>
-                <w:szCs w:val="16"/>
               </w:rPr>
             </w:pPr>
             <w:r>
               <w:rPr>
-                <w:rStyle w:val="CdigoHTML"/>
-                <w:rFonts w:ascii="Arial" w:eastAsiaTheme="minorEastAsia" w:hAnsi="Arial" w:cs="Arial"/>
-                <w:b w:val="0"/>
                 <w:noProof/>
-                <w:sz w:val="16"/>
-                <w:szCs w:val="16"/>
-              </w:rPr>
-              <w:t>{%</w:t>
-            </w:r>
-            <w:r>
-              <w:rPr>
-                <w:rStyle w:val="CdigoHTML"/>
-                <w:rFonts w:ascii="Arial" w:eastAsiaTheme="minorEastAsia" w:hAnsi="Arial" w:cs="Arial"/>
-                <w:b w:val="0"/>
-                <w:noProof/>
-                <w:sz w:val="16"/>
-                <w:szCs w:val="16"/>
-              </w:rPr>
-              <w:t xml:space="preserve"> tr</w:t>
-            </w:r>
-            <w:r>
-              <w:rPr>
-                <w:rStyle w:val="CdigoHTML"/>
-                <w:rFonts w:ascii="Arial" w:eastAsiaTheme="minorEastAsia" w:hAnsi="Arial" w:cs="Arial"/>
-                <w:b w:val="0"/>
-                <w:noProof/>
-                <w:sz w:val="16"/>
-                <w:szCs w:val="16"/>
-              </w:rPr>
-              <w:t xml:space="preserve"> for item in productos %} {{item.nombre}}</w:t>
-            </w:r>
-          </w:p>
-        </w:tc>
-        <w:tc>
-          <w:tcPr>
-            <w:tcW w:w="1276" w:type="dxa"/>
-            <w:gridSpan w:val="2"/>
-          </w:tcPr>
-          <w:p>
-            <w:pPr>
-              <w:cnfStyle w:val="000000100000" w:firstRow="0" w:lastRow="0" w:firstColumn="0" w:lastColumn="0" w:oddVBand="0" w:evenVBand="0" w:oddHBand="1" w:evenHBand="0" w:firstRowFirstColumn="0" w:firstRowLastColumn="0" w:lastRowFirstColumn="0" w:lastRowLastColumn="0"/>
-              <w:rPr>
-                <w:rFonts w:ascii="Arial" w:hAnsi="Arial" w:cs="Arial"/>
-                <w:noProof/>
-                <w:color w:val="000000" w:themeColor="text1"/>
-                <w:lang w:val="es-AR"/>
-              </w:rPr>
-            </w:pPr>
-            <w:r>
-              <w:rPr>
-                <w:rFonts w:ascii="Arial" w:hAnsi="Arial" w:cs="Arial"/>
-                <w:noProof/>
-              </w:rPr>
-              <w:t>{{item.desc}}</w:t>
-            </w:r>
-          </w:p>
-        </w:tc>
-        <w:tc>
-          <w:tcPr>
-            <w:tcW w:w="708" w:type="dxa"/>
-          </w:tcPr>
-          <w:p>
-            <w:pPr>
-              <w:cnfStyle w:val="000000100000" w:firstRow="0" w:lastRow="0" w:firstColumn="0" w:lastColumn="0" w:oddVBand="0" w:evenVBand="0" w:oddHBand="1" w:evenHBand="0" w:firstRowFirstColumn="0" w:firstRowLastColumn="0" w:lastRowFirstColumn="0" w:lastRowLastColumn="0"/>
-              <w:rPr>
-                <w:noProof/>
-                <w:color w:val="000000" w:themeColor="text1"/>
-              </w:rPr>
-            </w:pPr>
-            <w:r>
-              <w:rPr>
-                <w:rFonts w:ascii="Arial" w:hAnsi="Arial" w:cs="Arial"/>
-                <w:noProof/>
-                <w:color w:val="000000" w:themeColor="text1"/>
-              </w:rPr>
-              <w:t>1 pcs</w:t>
-            </w:r>
-            <w:r>
-              <w:rPr>
-                <w:noProof/>
-                <w:color w:val="000000" w:themeColor="text1"/>
-              </w:rPr>
-              <w:t>.</w:t>
+              </w:rPr>
+              <w:t>{% tr for item in productos %} {{item.nombre}}</w:t>
             </w:r>
           </w:p>
         </w:tc>
@@ -1508,98 +1430,84 @@
             <w:pPr>
               <w:cnfStyle w:val="000000100000" w:firstRow="0" w:lastRow="0" w:firstColumn="0" w:lastColumn="0" w:oddVBand="0" w:evenVBand="0" w:oddHBand="1" w:evenHBand="0" w:firstRowFirstColumn="0" w:firstRowLastColumn="0" w:lastRowFirstColumn="0" w:lastRowLastColumn="0"/>
               <w:rPr>
-                <w:rFonts w:ascii="Arial" w:hAnsi="Arial" w:cs="Arial"/>
                 <w:noProof/>
-                <w:color w:val="000000" w:themeColor="text1"/>
               </w:rPr>
             </w:pPr>
             <w:r>
               <w:rPr>
-                <w:rFonts w:ascii="Arial" w:hAnsi="Arial" w:cs="Arial"/>
                 <w:noProof/>
               </w:rPr>
-              <w:t>{{item.precio}}</w:t>
+              <w:t>{{item.desc}}</w:t>
             </w:r>
           </w:p>
         </w:tc>
         <w:tc>
           <w:tcPr>
-            <w:tcW w:w="1559" w:type="dxa"/>
+            <w:tcW w:w="709" w:type="dxa"/>
           </w:tcPr>
           <w:p>
             <w:pPr>
               <w:cnfStyle w:val="000000100000" w:firstRow="0" w:lastRow="0" w:firstColumn="0" w:lastColumn="0" w:oddVBand="0" w:evenVBand="0" w:oddHBand="1" w:evenHBand="0" w:firstRowFirstColumn="0" w:firstRowLastColumn="0" w:lastRowFirstColumn="0" w:lastRowLastColumn="0"/>
               <w:rPr>
-                <w:rFonts w:ascii="Arial" w:hAnsi="Arial" w:cs="Arial"/>
                 <w:noProof/>
-                <w:color w:val="000000" w:themeColor="text1"/>
-                <w:szCs w:val="16"/>
               </w:rPr>
             </w:pPr>
             <w:r>
               <w:rPr>
-                <w:rFonts w:ascii="Arial" w:hAnsi="Arial" w:cs="Arial"/>
                 <w:noProof/>
-                <w:szCs w:val="16"/>
-                <w:lang w:val="en-US"/>
-              </w:rPr>
+              </w:rPr>
+              <w:t>1 pcs.</w:t>
+            </w:r>
+          </w:p>
+        </w:tc>
+        <w:tc>
+          <w:tcPr>
+            <w:tcW w:w="1417" w:type="dxa"/>
+            <w:gridSpan w:val="2"/>
+          </w:tcPr>
+          <w:p>
+            <w:pPr>
+              <w:cnfStyle w:val="000000100000" w:firstRow="0" w:lastRow="0" w:firstColumn="0" w:lastColumn="0" w:oddVBand="0" w:evenVBand="0" w:oddHBand="1" w:evenHBand="0" w:firstRowFirstColumn="0" w:firstRowLastColumn="0" w:lastRowFirstColumn="0" w:lastRowLastColumn="0"/>
+            </w:pPr>
+            <w:r>
+              <w:t>{{</w:t>
+            </w:r>
+            <w:r>
+              <w:rPr>
+                <w:noProof/>
+              </w:rPr>
+              <w:t>item.precio</w:t>
+            </w:r>
+            <w:r>
+              <w:t>}}</w:t>
+            </w:r>
+          </w:p>
+        </w:tc>
+        <w:tc>
+          <w:tcPr>
+            <w:tcW w:w="1560" w:type="dxa"/>
+            <w:gridSpan w:val="2"/>
+          </w:tcPr>
+          <w:p>
+            <w:pPr>
+              <w:cnfStyle w:val="000000100000" w:firstRow="0" w:lastRow="0" w:firstColumn="0" w:lastColumn="0" w:oddVBand="0" w:evenVBand="0" w:oddHBand="1" w:evenHBand="0" w:firstRowFirstColumn="0" w:firstRowLastColumn="0" w:lastRowFirstColumn="0" w:lastRowLastColumn="0"/>
+            </w:pPr>
+            <w:r>
               <w:t>{{item.desc_val}}</w:t>
             </w:r>
           </w:p>
         </w:tc>
         <w:tc>
           <w:tcPr>
-            <w:tcW w:w="2694" w:type="dxa"/>
+            <w:tcW w:w="2835" w:type="dxa"/>
+            <w:gridSpan w:val="2"/>
           </w:tcPr>
           <w:p>
             <w:pPr>
               <w:cnfStyle w:val="000000100000" w:firstRow="0" w:lastRow="0" w:firstColumn="0" w:lastColumn="0" w:oddVBand="0" w:evenVBand="0" w:oddHBand="1" w:evenHBand="0" w:firstRowFirstColumn="0" w:firstRowLastColumn="0" w:lastRowFirstColumn="0" w:lastRowLastColumn="0"/>
-              <w:rPr>
-                <w:rFonts w:ascii="Arial" w:hAnsi="Arial" w:cs="Arial"/>
-                <w:noProof/>
-                <w:color w:val="000000" w:themeColor="text1"/>
-                <w:szCs w:val="16"/>
-              </w:rPr>
             </w:pPr>
             <w:r>
-              <w:rPr>
-                <w:rStyle w:val="CdigoHTML"/>
-                <w:rFonts w:ascii="Arial" w:eastAsiaTheme="minorEastAsia" w:hAnsi="Arial" w:cs="Arial"/>
-                <w:noProof/>
-                <w:sz w:val="16"/>
-                <w:szCs w:val="16"/>
-              </w:rPr>
-              <w:t>{{item.importe}} {%</w:t>
-            </w:r>
-            <w:r>
-              <w:rPr>
-                <w:rStyle w:val="CdigoHTML"/>
-                <w:rFonts w:ascii="Arial" w:eastAsiaTheme="minorEastAsia" w:hAnsi="Arial" w:cs="Arial"/>
-                <w:noProof/>
-                <w:sz w:val="16"/>
-                <w:szCs w:val="16"/>
-              </w:rPr>
-              <w:t xml:space="preserve"> tr</w:t>
-            </w:r>
-            <w:r>
-              <w:rPr>
-                <w:rStyle w:val="CdigoHTML"/>
-                <w:rFonts w:ascii="Arial" w:eastAsiaTheme="minorEastAsia" w:hAnsi="Arial" w:cs="Arial"/>
-                <w:noProof/>
-                <w:sz w:val="16"/>
-                <w:szCs w:val="16"/>
-              </w:rPr>
-              <w:t xml:space="preserve"> </w:t>
-            </w:r>
-            <w:r>
-              <w:rPr>
-                <w:rStyle w:val="CdigoHTML"/>
-                <w:rFonts w:ascii="Arial" w:eastAsiaTheme="minorEastAsia" w:hAnsi="Arial" w:cs="Arial"/>
-                <w:noProof/>
-                <w:sz w:val="16"/>
-                <w:szCs w:val="16"/>
-              </w:rPr>
-              <w:t>endfor %}</w:t>
+              <w:t>{{item.importe}} {% tr endfor %}</w:t>
             </w:r>
           </w:p>
         </w:tc>
@@ -1955,7 +1863,7 @@
                             <a:alphaModFix amt="35000"/>
                             <a:extLst>
                               <a:ext uri="">
-                                <a14:useLocalDpi xmlns:cx1="http://schemas.microsoft.com/office/drawing/2015/9/8/chartex" xmlns:cx2="http://schemas.microsoft.com/office/drawing/2015/10/21/chartex" xmlns:cx3="http://schemas.microsoft.com/office/drawing/2016/5/9/chartex" xmlns:cx4="http://schemas.microsoft.com/office/drawing/2016/5/10/chartex" xmlns:cx5="http://schemas.microsoft.com/office/drawing/2016/5/11/chartex" xmlns:cx6="http://schemas.microsoft.com/office/drawing/2016/5/12/chartex" xmlns:cx7="http://schemas.microsoft.com/office/drawing/2016/5/13/chartex" xmlns:cx8="http://schemas.microsoft.com/office/drawing/2016/5/14/chartex" xmlns:aink="http://schemas.microsoft.com/office/drawing/2016/ink" xmlns:am3d="http://schemas.microsoft.com/office/drawing/2017/model3d" xmlns:oel="http://schemas.microsoft.com/office/2019/extlst" xmlns:w16cex="http://schemas.microsoft.com/office/word/2018/wordml/cex" xmlns:w16cid="http://schemas.microsoft.com/office/word/2016/wordml/cid" xmlns:w16="http://schemas.microsoft.com/office/word/2018/wordml" xmlns:w16du="http://schemas.microsoft.com/office/word/2023/wordml/word16du" xmlns:w16sdtdh="http://schemas.microsoft.com/office/word/2020/wordml/sdtdatahash" xmlns:w16sdtfl="http://schemas.microsoft.com/office/word/2024/wordml/sdtformatlock" xmlns="" xmlns:o="urn:schemas-microsoft-com:office:office" xmlns:v="urn:schemas-microsoft-com:vml" xmlns:w10="urn:schemas-microsoft-com:office:word" xmlns:w="http://schemas.openxmlformats.org/wordprocessingml/2006/main" xmlns:a14="http://schemas.microsoft.com/office/drawing/2010/main" val="0"/>
+                                <a14:useLocalDpi xmlns:a14="http://schemas.microsoft.com/office/drawing/2010/main" xmlns:w="http://schemas.openxmlformats.org/wordprocessingml/2006/main" xmlns:w10="urn:schemas-microsoft-com:office:word" xmlns:v="urn:schemas-microsoft-com:vml" xmlns:o="urn:schemas-microsoft-com:office:office" xmlns="" xmlns:w16sdtfl="http://schemas.microsoft.com/office/word/2024/wordml/sdtformatlock" xmlns:w16sdtdh="http://schemas.microsoft.com/office/word/2020/wordml/sdtdatahash" xmlns:w16du="http://schemas.microsoft.com/office/word/2023/wordml/word16du" xmlns:w16="http://schemas.microsoft.com/office/word/2018/wordml" xmlns:w16cid="http://schemas.microsoft.com/office/word/2016/wordml/cid" xmlns:w16cex="http://schemas.microsoft.com/office/word/2018/wordml/cex" xmlns:oel="http://schemas.microsoft.com/office/2019/extlst" xmlns:am3d="http://schemas.microsoft.com/office/drawing/2017/model3d" xmlns:aink="http://schemas.microsoft.com/office/drawing/2016/ink" xmlns:cx8="http://schemas.microsoft.com/office/drawing/2016/5/14/chartex" xmlns:cx7="http://schemas.microsoft.com/office/drawing/2016/5/13/chartex" xmlns:cx6="http://schemas.microsoft.com/office/drawing/2016/5/12/chartex" xmlns:cx5="http://schemas.microsoft.com/office/drawing/2016/5/11/chartex" xmlns:cx4="http://schemas.microsoft.com/office/drawing/2016/5/10/chartex" xmlns:cx3="http://schemas.microsoft.com/office/drawing/2016/5/9/chartex" xmlns:cx2="http://schemas.microsoft.com/office/drawing/2015/10/21/chartex" xmlns:cx1="http://schemas.microsoft.com/office/drawing/2015/9/8/chartex" val="0"/>
                               </a:ext>
                             </a:extLst>
                           </a:blip>
@@ -2048,7 +1956,7 @@
                     </wp:anchor>
                   </w:drawing>
                 </mc:Choice>
-                <mc:Fallback xmlns:cx1="http://schemas.microsoft.com/office/drawing/2015/9/8/chartex" xmlns:cx2="http://schemas.microsoft.com/office/drawing/2015/10/21/chartex" xmlns:cx3="http://schemas.microsoft.com/office/drawing/2016/5/9/chartex" xmlns:cx4="http://schemas.microsoft.com/office/drawing/2016/5/10/chartex" xmlns:cx5="http://schemas.microsoft.com/office/drawing/2016/5/11/chartex" xmlns:cx6="http://schemas.microsoft.com/office/drawing/2016/5/12/chartex" xmlns:cx7="http://schemas.microsoft.com/office/drawing/2016/5/13/chartex" xmlns:cx8="http://schemas.microsoft.com/office/drawing/2016/5/14/chartex" xmlns:aink="http://schemas.microsoft.com/office/drawing/2016/ink" xmlns:am3d="http://schemas.microsoft.com/office/drawing/2017/model3d" xmlns:oel="http://schemas.microsoft.com/office/2019/extlst" xmlns:w16cex="http://schemas.microsoft.com/office/word/2018/wordml/cex" xmlns:w16cid="http://schemas.microsoft.com/office/word/2016/wordml/cid" xmlns:w16="http://schemas.microsoft.com/office/word/2018/wordml" xmlns:w16du="http://schemas.microsoft.com/office/word/2023/wordml/word16du" xmlns:w16sdtdh="http://schemas.microsoft.com/office/word/2020/wordml/sdtdatahash" xmlns:w16sdtfl="http://schemas.microsoft.com/office/word/2024/wordml/sdtformatlock">
+                <mc:Fallback xmlns:w16sdtfl="http://schemas.microsoft.com/office/word/2024/wordml/sdtformatlock" xmlns:w16sdtdh="http://schemas.microsoft.com/office/word/2020/wordml/sdtdatahash" xmlns:w16du="http://schemas.microsoft.com/office/word/2023/wordml/word16du" xmlns:w16="http://schemas.microsoft.com/office/word/2018/wordml" xmlns:w16cid="http://schemas.microsoft.com/office/word/2016/wordml/cid" xmlns:w16cex="http://schemas.microsoft.com/office/word/2018/wordml/cex" xmlns:oel="http://schemas.microsoft.com/office/2019/extlst" xmlns:am3d="http://schemas.microsoft.com/office/drawing/2017/model3d" xmlns:aink="http://schemas.microsoft.com/office/drawing/2016/ink" xmlns:cx8="http://schemas.microsoft.com/office/drawing/2016/5/14/chartex" xmlns:cx7="http://schemas.microsoft.com/office/drawing/2016/5/13/chartex" xmlns:cx6="http://schemas.microsoft.com/office/drawing/2016/5/12/chartex" xmlns:cx5="http://schemas.microsoft.com/office/drawing/2016/5/11/chartex" xmlns:cx4="http://schemas.microsoft.com/office/drawing/2016/5/10/chartex" xmlns:cx3="http://schemas.microsoft.com/office/drawing/2016/5/9/chartex" xmlns:cx2="http://schemas.microsoft.com/office/drawing/2015/10/21/chartex" xmlns:cx1="http://schemas.microsoft.com/office/drawing/2015/9/8/chartex">
                   <w:pict>
                     <v:line w14:anchorId="22A5DB73" id="Conector recto 9" o:spid="_x0000_s1026" style="position:absolute;z-index:251676672;visibility:visible;mso-wrap-style:square;mso-width-percent:0;mso-height-percent:0;mso-wrap-distance-left:9pt;mso-wrap-distance-top:0;mso-wrap-distance-right:9pt;mso-wrap-distance-bottom:0;mso-position-horizontal:absolute;mso-position-horizontal-relative:text;mso-position-vertical:absolute;mso-position-vertical-relative:text;mso-width-percent:0;mso-height-percent:0;mso-width-relative:margin;mso-height-relative:margin" from="332.05pt,86.85pt" to="467.65pt,86.85pt" o:gfxdata="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" strokecolor="black [3040]"/>
                   </w:pict>
@@ -5010,26 +4918,6 @@
 </file>
 
 <file path=customXml/item1.xml><?xml version="1.0" encoding="utf-8"?>
-<p:properties xmlns:p="http://schemas.microsoft.com/office/2006/metadata/properties" xmlns:xsi="http://www.w3.org/2001/XMLSchema-instance" xmlns:pc="http://schemas.microsoft.com/office/infopath/2007/PartnerControls">
-  <documentManagement>
-    <_ip_UnifiedCompliancePolicyUIAction xmlns="http://schemas.microsoft.com/sharepoint/v3" xsi:nil="true"/>
-    <Image xmlns="71af3243-3dd4-4a8d-8c0d-dd76da1f02a5">
-      <Url xsi:nil="true"/>
-      <Description xsi:nil="true"/>
-    </Image>
-    <Status xmlns="71af3243-3dd4-4a8d-8c0d-dd76da1f02a5">Not started</Status>
-    <Background xmlns="71af3243-3dd4-4a8d-8c0d-dd76da1f02a5">false</Background>
-    <_ip_UnifiedCompliancePolicyProperties xmlns="http://schemas.microsoft.com/sharepoint/v3" xsi:nil="true"/>
-    <ImageTagsTaxHTField xmlns="71af3243-3dd4-4a8d-8c0d-dd76da1f02a5">
-      <Terms xmlns="http://schemas.microsoft.com/office/infopath/2007/PartnerControls"/>
-    </ImageTagsTaxHTField>
-    <TaxCatchAll xmlns="230e9df3-be65-4c73-a93b-d1236ebd677e" xsi:nil="true"/>
-    <MediaServiceKeyPoints xmlns="71af3243-3dd4-4a8d-8c0d-dd76da1f02a5" xsi:nil="true"/>
-  </documentManagement>
-</p:properties>
-</file>
-
-<file path=customXml/item2.xml><?xml version="1.0" encoding="utf-8"?>
 <ct:contentTypeSchema xmlns:ct="http://schemas.microsoft.com/office/2006/metadata/contentType" xmlns:ma="http://schemas.microsoft.com/office/2006/metadata/properties/metaAttributes" ct:_="" ma:_="" ma:contentTypeName="Document" ma:contentTypeID="0x01010079F111ED35F8CC479449609E8A0923A6" ma:contentTypeVersion="26" ma:contentTypeDescription="Create a new document." ma:contentTypeScope="" ma:versionID="ac37c1753acd5e330d2062ccec26ea66">
   <xsd:schema xmlns:xsd="http://www.w3.org/2001/XMLSchema" xmlns:xs="http://www.w3.org/2001/XMLSchema" xmlns:p="http://schemas.microsoft.com/office/2006/metadata/properties" xmlns:ns1="http://schemas.microsoft.com/sharepoint/v3" xmlns:ns2="71af3243-3dd4-4a8d-8c0d-dd76da1f02a5" xmlns:ns3="16c05727-aa75-4e4a-9b5f-8a80a1165891" xmlns:ns4="230e9df3-be65-4c73-a93b-d1236ebd677e" targetNamespace="http://schemas.microsoft.com/office/2006/metadata/properties" ma:root="true" ma:fieldsID="3b340c7101c92c5120abd06486f94548" ns1:_="" ns2:_="" ns3:_="" ns4:_="">
     <xsd:import namespace="http://schemas.microsoft.com/sharepoint/v3"/>
@@ -5329,6 +5217,26 @@
 </ct:contentTypeSchema>
 </file>
 
+<file path=customXml/item2.xml><?xml version="1.0" encoding="utf-8"?>
+<p:properties xmlns:p="http://schemas.microsoft.com/office/2006/metadata/properties" xmlns:xsi="http://www.w3.org/2001/XMLSchema-instance" xmlns:pc="http://schemas.microsoft.com/office/infopath/2007/PartnerControls">
+  <documentManagement>
+    <_ip_UnifiedCompliancePolicyUIAction xmlns="http://schemas.microsoft.com/sharepoint/v3" xsi:nil="true"/>
+    <Image xmlns="71af3243-3dd4-4a8d-8c0d-dd76da1f02a5">
+      <Url xsi:nil="true"/>
+      <Description xsi:nil="true"/>
+    </Image>
+    <Status xmlns="71af3243-3dd4-4a8d-8c0d-dd76da1f02a5">Not started</Status>
+    <Background xmlns="71af3243-3dd4-4a8d-8c0d-dd76da1f02a5">false</Background>
+    <_ip_UnifiedCompliancePolicyProperties xmlns="http://schemas.microsoft.com/sharepoint/v3" xsi:nil="true"/>
+    <ImageTagsTaxHTField xmlns="71af3243-3dd4-4a8d-8c0d-dd76da1f02a5">
+      <Terms xmlns="http://schemas.microsoft.com/office/infopath/2007/PartnerControls"/>
+    </ImageTagsTaxHTField>
+    <TaxCatchAll xmlns="230e9df3-be65-4c73-a93b-d1236ebd677e" xsi:nil="true"/>
+    <MediaServiceKeyPoints xmlns="71af3243-3dd4-4a8d-8c0d-dd76da1f02a5" xsi:nil="true"/>
+  </documentManagement>
+</p:properties>
+</file>
+
 <file path=customXml/item3.xml><?xml version="1.0" encoding="utf-8"?>
 <?mso-contentType ?>
 <FormTemplates xmlns="http://schemas.microsoft.com/sharepoint/v3/contenttype/forms">
@@ -5343,18 +5251,6 @@
 </file>
 
 <file path=customXml/itemProps1.xml><?xml version="1.0" encoding="utf-8"?>
-<ds:datastoreItem xmlns:ds="http://schemas.openxmlformats.org/officeDocument/2006/customXml" ds:itemID="{D189125E-F545-46E5-B780-871CAFC26324}">
-  <ds:schemaRefs>
-    <ds:schemaRef ds:uri="http://schemas.microsoft.com/office/2006/metadata/properties"/>
-    <ds:schemaRef ds:uri="http://schemas.microsoft.com/office/infopath/2007/PartnerControls"/>
-    <ds:schemaRef ds:uri="http://schemas.microsoft.com/sharepoint/v3"/>
-    <ds:schemaRef ds:uri="71af3243-3dd4-4a8d-8c0d-dd76da1f02a5"/>
-    <ds:schemaRef ds:uri="230e9df3-be65-4c73-a93b-d1236ebd677e"/>
-  </ds:schemaRefs>
-</ds:datastoreItem>
-</file>
-
-<file path=customXml/itemProps2.xml><?xml version="1.0" encoding="utf-8"?>
 <ds:datastoreItem xmlns:ds="http://schemas.openxmlformats.org/officeDocument/2006/customXml" ds:itemID="{33CF9CD8-197E-44B2-AC01-616EC0F8C03F}">
   <ds:schemaRefs>
     <ds:schemaRef ds:uri="http://schemas.microsoft.com/office/2006/metadata/contentType"/>
@@ -5375,6 +5271,18 @@
 </ds:datastoreItem>
 </file>
 
+<file path=customXml/itemProps2.xml><?xml version="1.0" encoding="utf-8"?>
+<ds:datastoreItem xmlns:ds="http://schemas.openxmlformats.org/officeDocument/2006/customXml" ds:itemID="{D189125E-F545-46E5-B780-871CAFC26324}">
+  <ds:schemaRefs>
+    <ds:schemaRef ds:uri="http://schemas.microsoft.com/office/2006/metadata/properties"/>
+    <ds:schemaRef ds:uri="http://schemas.microsoft.com/office/infopath/2007/PartnerControls"/>
+    <ds:schemaRef ds:uri="http://schemas.microsoft.com/sharepoint/v3"/>
+    <ds:schemaRef ds:uri="71af3243-3dd4-4a8d-8c0d-dd76da1f02a5"/>
+    <ds:schemaRef ds:uri="230e9df3-be65-4c73-a93b-d1236ebd677e"/>
+  </ds:schemaRefs>
+</ds:datastoreItem>
+</file>
+
 <file path=customXml/itemProps3.xml><?xml version="1.0" encoding="utf-8"?>
 <ds:datastoreItem xmlns:ds="http://schemas.openxmlformats.org/officeDocument/2006/customXml" ds:itemID="{0FBE260B-89FA-4C2A-8CC6-AF410096B44F}">
   <ds:schemaRefs>
@@ -5384,7 +5292,7 @@
 </file>
 
 <file path=customXml/itemProps4.xml><?xml version="1.0" encoding="utf-8"?>
-<ds:datastoreItem xmlns:ds="http://schemas.openxmlformats.org/officeDocument/2006/customXml" ds:itemID="{D717344F-00B3-429D-8EB0-9FF2A849F283}">
+<ds:datastoreItem xmlns:ds="http://schemas.openxmlformats.org/officeDocument/2006/customXml" ds:itemID="{087BCC50-86F0-45C1-9692-D740B0A3C0B5}">
   <ds:schemaRefs>
     <ds:schemaRef ds:uri="http://schemas.openxmlformats.org/officeDocument/2006/bibliography"/>
   </ds:schemaRefs>

</xml_diff>

<commit_message>
Apagando el corrector de raiz y limpiando XML
</commit_message>
<xml_diff>
--- a/plantilla_int.docx
+++ b/plantilla_int.docx
@@ -646,7 +646,7 @@
                     </wp:anchor>
                   </w:drawing>
                 </mc:Choice>
-                <mc:Fallback xmlns:w16sdtfl="http://schemas.microsoft.com/office/word/2024/wordml/sdtformatlock" xmlns:w16sdtdh="http://schemas.microsoft.com/office/word/2020/wordml/sdtdatahash" xmlns:w16du="http://schemas.microsoft.com/office/word/2023/wordml/word16du" xmlns:w16="http://schemas.microsoft.com/office/word/2018/wordml" xmlns:w16cid="http://schemas.microsoft.com/office/word/2016/wordml/cid" xmlns:w16cex="http://schemas.microsoft.com/office/word/2018/wordml/cex" xmlns:oel="http://schemas.microsoft.com/office/2019/extlst" xmlns:am3d="http://schemas.microsoft.com/office/drawing/2017/model3d" xmlns:aink="http://schemas.microsoft.com/office/drawing/2016/ink" xmlns:cx8="http://schemas.microsoft.com/office/drawing/2016/5/14/chartex" xmlns:cx7="http://schemas.microsoft.com/office/drawing/2016/5/13/chartex" xmlns:cx6="http://schemas.microsoft.com/office/drawing/2016/5/12/chartex" xmlns:cx5="http://schemas.microsoft.com/office/drawing/2016/5/11/chartex" xmlns:cx4="http://schemas.microsoft.com/office/drawing/2016/5/10/chartex" xmlns:cx3="http://schemas.microsoft.com/office/drawing/2016/5/9/chartex" xmlns:cx2="http://schemas.microsoft.com/office/drawing/2015/10/21/chartex" xmlns:cx1="http://schemas.microsoft.com/office/drawing/2015/9/8/chartex">
+                <mc:Fallback xmlns:cx1="http://schemas.microsoft.com/office/drawing/2015/9/8/chartex" xmlns:cx2="http://schemas.microsoft.com/office/drawing/2015/10/21/chartex" xmlns:cx3="http://schemas.microsoft.com/office/drawing/2016/5/9/chartex" xmlns:cx4="http://schemas.microsoft.com/office/drawing/2016/5/10/chartex" xmlns:cx5="http://schemas.microsoft.com/office/drawing/2016/5/11/chartex" xmlns:cx6="http://schemas.microsoft.com/office/drawing/2016/5/12/chartex" xmlns:cx7="http://schemas.microsoft.com/office/drawing/2016/5/13/chartex" xmlns:cx8="http://schemas.microsoft.com/office/drawing/2016/5/14/chartex" xmlns:aink="http://schemas.microsoft.com/office/drawing/2016/ink" xmlns:am3d="http://schemas.microsoft.com/office/drawing/2017/model3d" xmlns:oel="http://schemas.microsoft.com/office/2019/extlst" xmlns:w16cex="http://schemas.microsoft.com/office/word/2018/wordml/cex" xmlns:w16cid="http://schemas.microsoft.com/office/word/2016/wordml/cid" xmlns:w16="http://schemas.microsoft.com/office/word/2018/wordml" xmlns:w16du="http://schemas.microsoft.com/office/word/2023/wordml/word16du" xmlns:w16sdtdh="http://schemas.microsoft.com/office/word/2020/wordml/sdtdatahash" xmlns:w16sdtfl="http://schemas.microsoft.com/office/word/2024/wordml/sdtformatlock">
                   <w:pict>
                     <v:line w14:anchorId="4C297CA5" id="Conector recto 6" o:spid="_x0000_s1026" style="position:absolute;flip:y;z-index:251670528;visibility:visible;mso-wrap-style:square;mso-wrap-distance-left:9pt;mso-wrap-distance-top:0;mso-wrap-distance-right:9pt;mso-wrap-distance-bottom:0;mso-position-horizontal:absolute;mso-position-horizontal-relative:text;mso-position-vertical:absolute;mso-position-vertical-relative:text" from="-47.5pt,8.85pt" to="508.7pt,11.25pt" o:gfxdata="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" strokecolor="black [3040]"/>
                   </w:pict>
@@ -675,6 +675,7 @@
         </w:tc>
       </w:tr>
     </w:tbl>
+    <w:bookmarkStart w:id="0" w:name="_GoBack"/>
     <w:p>
       <w:pPr>
         <w:rPr>
@@ -1014,7 +1015,7 @@
     <w:tbl>
       <w:tblPr>
         <w:tblStyle w:val="Tabladecuadrcula4-nfasis4"/>
-        <w:tblW w:w="5469" w:type="pct"/>
+        <w:tblW w:w="0" w:type="auto"/>
         <w:tblInd w:w="-431" w:type="dxa"/>
         <w:tblLayout w:type="fixed"/>
         <w:tblLook w:val="0620" w:firstRow="1" w:lastRow="0" w:firstColumn="0" w:lastColumn="0" w:noHBand="1" w:noVBand="1"/>
@@ -1035,8 +1036,9 @@
         </w:trPr>
         <w:tc>
           <w:tcPr>
-            <w:tcW w:w="1844" w:type="dxa"/>
+            <w:tcW w:w="1845" w:type="dxa"/>
           </w:tcPr>
+          <w:bookmarkEnd w:id="0"/>
           <w:p>
             <w:pPr>
               <w:pStyle w:val="Encabezadosdecolumna"/>
@@ -1164,7 +1166,7 @@
         </w:trPr>
         <w:tc>
           <w:tcPr>
-            <w:tcW w:w="1844" w:type="dxa"/>
+            <w:tcW w:w="1845" w:type="dxa"/>
           </w:tcPr>
           <w:p>
             <w:pPr>
@@ -1281,8 +1283,8 @@
             <w:pPr>
               <w:widowControl w:val="0"/>
             </w:pPr>
-            <w:bookmarkStart w:id="0" w:name="__DdeLink__139_614838437"/>
-            <w:bookmarkEnd w:id="0"/>
+            <w:bookmarkStart w:id="1" w:name="__DdeLink__139_614838437"/>
+            <w:bookmarkEnd w:id="1"/>
           </w:p>
         </w:tc>
       </w:tr>
@@ -1297,7 +1299,7 @@
     <w:tbl>
       <w:tblPr>
         <w:tblStyle w:val="Tabladecuadrcula4-nfasis4"/>
-        <w:tblW w:w="10491" w:type="dxa"/>
+        <w:tblW w:w="0" w:type="auto"/>
         <w:tblInd w:w="-431" w:type="dxa"/>
         <w:tblLayout w:type="fixed"/>
         <w:tblLook w:val="04A0" w:firstRow="1" w:lastRow="0" w:firstColumn="1" w:lastColumn="0" w:noHBand="0" w:noVBand="1"/>
@@ -1411,14 +1413,31 @@
           <w:p>
             <w:pPr>
               <w:rPr>
+                <w:b w:val="0"/>
                 <w:noProof/>
               </w:rPr>
             </w:pPr>
             <w:r>
               <w:rPr>
+                <w:b w:val="0"/>
                 <w:noProof/>
               </w:rPr>
-              <w:t>{% tr for item in productos %} {{item.nombre}}</w:t>
+              <w:t>{% tr for item in productos %}</w:t>
+            </w:r>
+          </w:p>
+          <w:p>
+            <w:pPr>
+              <w:rPr>
+                <w:b w:val="0"/>
+                <w:noProof/>
+              </w:rPr>
+            </w:pPr>
+            <w:r>
+              <w:rPr>
+                <w:b w:val="0"/>
+                <w:noProof/>
+              </w:rPr>
+              <w:t>{{item.nombre}}</w:t>
             </w:r>
           </w:p>
         </w:tc>
@@ -1507,7 +1526,15 @@
               <w:cnfStyle w:val="000000100000" w:firstRow="0" w:lastRow="0" w:firstColumn="0" w:lastColumn="0" w:oddVBand="0" w:evenVBand="0" w:oddHBand="1" w:evenHBand="0" w:firstRowFirstColumn="0" w:firstRowLastColumn="0" w:lastRowFirstColumn="0" w:lastRowLastColumn="0"/>
             </w:pPr>
             <w:r>
-              <w:t>{{item.importe}} {% tr endfor %}</w:t>
+              <w:t>{{item.importe}}</w:t>
+            </w:r>
+          </w:p>
+          <w:p>
+            <w:pPr>
+              <w:cnfStyle w:val="000000100000" w:firstRow="0" w:lastRow="0" w:firstColumn="0" w:lastColumn="0" w:oddVBand="0" w:evenVBand="0" w:oddHBand="1" w:evenHBand="0" w:firstRowFirstColumn="0" w:firstRowLastColumn="0" w:lastRowFirstColumn="0" w:lastRowLastColumn="0"/>
+            </w:pPr>
+            <w:r>
+              <w:t>{% tr endfor %}</w:t>
             </w:r>
           </w:p>
         </w:tc>
@@ -1792,8 +1819,13 @@
           <w:color w:val="000000" w:themeColor="text1"/>
         </w:rPr>
       </w:pPr>
-      <w:bookmarkStart w:id="1" w:name="_GoBack"/>
-      <w:bookmarkEnd w:id="1"/>
+      <w:r>
+        <w:rPr>
+          <w:noProof/>
+          <w:color w:val="000000" w:themeColor="text1"/>
+        </w:rPr>
+        <w:t xml:space="preserve"> </w:t>
+      </w:r>
     </w:p>
     <w:tbl>
       <w:tblPr>
@@ -1863,7 +1895,7 @@
                             <a:alphaModFix amt="35000"/>
                             <a:extLst>
                               <a:ext uri="">
-                                <a14:useLocalDpi xmlns:a14="http://schemas.microsoft.com/office/drawing/2010/main" xmlns:w="http://schemas.openxmlformats.org/wordprocessingml/2006/main" xmlns:w10="urn:schemas-microsoft-com:office:word" xmlns:v="urn:schemas-microsoft-com:vml" xmlns:o="urn:schemas-microsoft-com:office:office" xmlns="" xmlns:w16sdtfl="http://schemas.microsoft.com/office/word/2024/wordml/sdtformatlock" xmlns:w16sdtdh="http://schemas.microsoft.com/office/word/2020/wordml/sdtdatahash" xmlns:w16du="http://schemas.microsoft.com/office/word/2023/wordml/word16du" xmlns:w16="http://schemas.microsoft.com/office/word/2018/wordml" xmlns:w16cid="http://schemas.microsoft.com/office/word/2016/wordml/cid" xmlns:w16cex="http://schemas.microsoft.com/office/word/2018/wordml/cex" xmlns:oel="http://schemas.microsoft.com/office/2019/extlst" xmlns:am3d="http://schemas.microsoft.com/office/drawing/2017/model3d" xmlns:aink="http://schemas.microsoft.com/office/drawing/2016/ink" xmlns:cx8="http://schemas.microsoft.com/office/drawing/2016/5/14/chartex" xmlns:cx7="http://schemas.microsoft.com/office/drawing/2016/5/13/chartex" xmlns:cx6="http://schemas.microsoft.com/office/drawing/2016/5/12/chartex" xmlns:cx5="http://schemas.microsoft.com/office/drawing/2016/5/11/chartex" xmlns:cx4="http://schemas.microsoft.com/office/drawing/2016/5/10/chartex" xmlns:cx3="http://schemas.microsoft.com/office/drawing/2016/5/9/chartex" xmlns:cx2="http://schemas.microsoft.com/office/drawing/2015/10/21/chartex" xmlns:cx1="http://schemas.microsoft.com/office/drawing/2015/9/8/chartex" val="0"/>
+                                <a14:useLocalDpi xmlns:cx1="http://schemas.microsoft.com/office/drawing/2015/9/8/chartex" xmlns:cx2="http://schemas.microsoft.com/office/drawing/2015/10/21/chartex" xmlns:cx3="http://schemas.microsoft.com/office/drawing/2016/5/9/chartex" xmlns:cx4="http://schemas.microsoft.com/office/drawing/2016/5/10/chartex" xmlns:cx5="http://schemas.microsoft.com/office/drawing/2016/5/11/chartex" xmlns:cx6="http://schemas.microsoft.com/office/drawing/2016/5/12/chartex" xmlns:cx7="http://schemas.microsoft.com/office/drawing/2016/5/13/chartex" xmlns:cx8="http://schemas.microsoft.com/office/drawing/2016/5/14/chartex" xmlns:aink="http://schemas.microsoft.com/office/drawing/2016/ink" xmlns:am3d="http://schemas.microsoft.com/office/drawing/2017/model3d" xmlns:oel="http://schemas.microsoft.com/office/2019/extlst" xmlns:w16cex="http://schemas.microsoft.com/office/word/2018/wordml/cex" xmlns:w16cid="http://schemas.microsoft.com/office/word/2016/wordml/cid" xmlns:w16="http://schemas.microsoft.com/office/word/2018/wordml" xmlns:w16du="http://schemas.microsoft.com/office/word/2023/wordml/word16du" xmlns:w16sdtdh="http://schemas.microsoft.com/office/word/2020/wordml/sdtdatahash" xmlns:w16sdtfl="http://schemas.microsoft.com/office/word/2024/wordml/sdtformatlock" xmlns="" xmlns:o="urn:schemas-microsoft-com:office:office" xmlns:v="urn:schemas-microsoft-com:vml" xmlns:w10="urn:schemas-microsoft-com:office:word" xmlns:w="http://schemas.openxmlformats.org/wordprocessingml/2006/main" xmlns:a14="http://schemas.microsoft.com/office/drawing/2010/main" val="0"/>
                               </a:ext>
                             </a:extLst>
                           </a:blip>
@@ -1956,7 +1988,7 @@
                     </wp:anchor>
                   </w:drawing>
                 </mc:Choice>
-                <mc:Fallback xmlns:w16sdtfl="http://schemas.microsoft.com/office/word/2024/wordml/sdtformatlock" xmlns:w16sdtdh="http://schemas.microsoft.com/office/word/2020/wordml/sdtdatahash" xmlns:w16du="http://schemas.microsoft.com/office/word/2023/wordml/word16du" xmlns:w16="http://schemas.microsoft.com/office/word/2018/wordml" xmlns:w16cid="http://schemas.microsoft.com/office/word/2016/wordml/cid" xmlns:w16cex="http://schemas.microsoft.com/office/word/2018/wordml/cex" xmlns:oel="http://schemas.microsoft.com/office/2019/extlst" xmlns:am3d="http://schemas.microsoft.com/office/drawing/2017/model3d" xmlns:aink="http://schemas.microsoft.com/office/drawing/2016/ink" xmlns:cx8="http://schemas.microsoft.com/office/drawing/2016/5/14/chartex" xmlns:cx7="http://schemas.microsoft.com/office/drawing/2016/5/13/chartex" xmlns:cx6="http://schemas.microsoft.com/office/drawing/2016/5/12/chartex" xmlns:cx5="http://schemas.microsoft.com/office/drawing/2016/5/11/chartex" xmlns:cx4="http://schemas.microsoft.com/office/drawing/2016/5/10/chartex" xmlns:cx3="http://schemas.microsoft.com/office/drawing/2016/5/9/chartex" xmlns:cx2="http://schemas.microsoft.com/office/drawing/2015/10/21/chartex" xmlns:cx1="http://schemas.microsoft.com/office/drawing/2015/9/8/chartex">
+                <mc:Fallback xmlns:cx1="http://schemas.microsoft.com/office/drawing/2015/9/8/chartex" xmlns:cx2="http://schemas.microsoft.com/office/drawing/2015/10/21/chartex" xmlns:cx3="http://schemas.microsoft.com/office/drawing/2016/5/9/chartex" xmlns:cx4="http://schemas.microsoft.com/office/drawing/2016/5/10/chartex" xmlns:cx5="http://schemas.microsoft.com/office/drawing/2016/5/11/chartex" xmlns:cx6="http://schemas.microsoft.com/office/drawing/2016/5/12/chartex" xmlns:cx7="http://schemas.microsoft.com/office/drawing/2016/5/13/chartex" xmlns:cx8="http://schemas.microsoft.com/office/drawing/2016/5/14/chartex" xmlns:aink="http://schemas.microsoft.com/office/drawing/2016/ink" xmlns:am3d="http://schemas.microsoft.com/office/drawing/2017/model3d" xmlns:oel="http://schemas.microsoft.com/office/2019/extlst" xmlns:w16cex="http://schemas.microsoft.com/office/word/2018/wordml/cex" xmlns:w16cid="http://schemas.microsoft.com/office/word/2016/wordml/cid" xmlns:w16="http://schemas.microsoft.com/office/word/2018/wordml" xmlns:w16du="http://schemas.microsoft.com/office/word/2023/wordml/word16du" xmlns:w16sdtdh="http://schemas.microsoft.com/office/word/2020/wordml/sdtdatahash" xmlns:w16sdtfl="http://schemas.microsoft.com/office/word/2024/wordml/sdtformatlock">
                   <w:pict>
                     <v:line w14:anchorId="22A5DB73" id="Conector recto 9" o:spid="_x0000_s1026" style="position:absolute;z-index:251676672;visibility:visible;mso-wrap-style:square;mso-width-percent:0;mso-height-percent:0;mso-wrap-distance-left:9pt;mso-wrap-distance-top:0;mso-wrap-distance-right:9pt;mso-wrap-distance-bottom:0;mso-position-horizontal:absolute;mso-position-horizontal-relative:text;mso-position-vertical:absolute;mso-position-vertical-relative:text;mso-width-percent:0;mso-height-percent:0;mso-width-relative:margin;mso-height-relative:margin" from="332.05pt,86.85pt" to="467.65pt,86.85pt" o:gfxdata="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" strokecolor="black [3040]"/>
                   </w:pict>
@@ -4918,6 +4950,26 @@
 </file>
 
 <file path=customXml/item1.xml><?xml version="1.0" encoding="utf-8"?>
+<p:properties xmlns:p="http://schemas.microsoft.com/office/2006/metadata/properties" xmlns:xsi="http://www.w3.org/2001/XMLSchema-instance" xmlns:pc="http://schemas.microsoft.com/office/infopath/2007/PartnerControls">
+  <documentManagement>
+    <_ip_UnifiedCompliancePolicyUIAction xmlns="http://schemas.microsoft.com/sharepoint/v3" xsi:nil="true"/>
+    <Image xmlns="71af3243-3dd4-4a8d-8c0d-dd76da1f02a5">
+      <Url xsi:nil="true"/>
+      <Description xsi:nil="true"/>
+    </Image>
+    <Status xmlns="71af3243-3dd4-4a8d-8c0d-dd76da1f02a5">Not started</Status>
+    <Background xmlns="71af3243-3dd4-4a8d-8c0d-dd76da1f02a5">false</Background>
+    <_ip_UnifiedCompliancePolicyProperties xmlns="http://schemas.microsoft.com/sharepoint/v3" xsi:nil="true"/>
+    <ImageTagsTaxHTField xmlns="71af3243-3dd4-4a8d-8c0d-dd76da1f02a5">
+      <Terms xmlns="http://schemas.microsoft.com/office/infopath/2007/PartnerControls"/>
+    </ImageTagsTaxHTField>
+    <TaxCatchAll xmlns="230e9df3-be65-4c73-a93b-d1236ebd677e" xsi:nil="true"/>
+    <MediaServiceKeyPoints xmlns="71af3243-3dd4-4a8d-8c0d-dd76da1f02a5" xsi:nil="true"/>
+  </documentManagement>
+</p:properties>
+</file>
+
+<file path=customXml/item2.xml><?xml version="1.0" encoding="utf-8"?>
 <ct:contentTypeSchema xmlns:ct="http://schemas.microsoft.com/office/2006/metadata/contentType" xmlns:ma="http://schemas.microsoft.com/office/2006/metadata/properties/metaAttributes" ct:_="" ma:_="" ma:contentTypeName="Document" ma:contentTypeID="0x01010079F111ED35F8CC479449609E8A0923A6" ma:contentTypeVersion="26" ma:contentTypeDescription="Create a new document." ma:contentTypeScope="" ma:versionID="ac37c1753acd5e330d2062ccec26ea66">
   <xsd:schema xmlns:xsd="http://www.w3.org/2001/XMLSchema" xmlns:xs="http://www.w3.org/2001/XMLSchema" xmlns:p="http://schemas.microsoft.com/office/2006/metadata/properties" xmlns:ns1="http://schemas.microsoft.com/sharepoint/v3" xmlns:ns2="71af3243-3dd4-4a8d-8c0d-dd76da1f02a5" xmlns:ns3="16c05727-aa75-4e4a-9b5f-8a80a1165891" xmlns:ns4="230e9df3-be65-4c73-a93b-d1236ebd677e" targetNamespace="http://schemas.microsoft.com/office/2006/metadata/properties" ma:root="true" ma:fieldsID="3b340c7101c92c5120abd06486f94548" ns1:_="" ns2:_="" ns3:_="" ns4:_="">
     <xsd:import namespace="http://schemas.microsoft.com/sharepoint/v3"/>
@@ -5217,26 +5269,6 @@
 </ct:contentTypeSchema>
 </file>
 
-<file path=customXml/item2.xml><?xml version="1.0" encoding="utf-8"?>
-<p:properties xmlns:p="http://schemas.microsoft.com/office/2006/metadata/properties" xmlns:xsi="http://www.w3.org/2001/XMLSchema-instance" xmlns:pc="http://schemas.microsoft.com/office/infopath/2007/PartnerControls">
-  <documentManagement>
-    <_ip_UnifiedCompliancePolicyUIAction xmlns="http://schemas.microsoft.com/sharepoint/v3" xsi:nil="true"/>
-    <Image xmlns="71af3243-3dd4-4a8d-8c0d-dd76da1f02a5">
-      <Url xsi:nil="true"/>
-      <Description xsi:nil="true"/>
-    </Image>
-    <Status xmlns="71af3243-3dd4-4a8d-8c0d-dd76da1f02a5">Not started</Status>
-    <Background xmlns="71af3243-3dd4-4a8d-8c0d-dd76da1f02a5">false</Background>
-    <_ip_UnifiedCompliancePolicyProperties xmlns="http://schemas.microsoft.com/sharepoint/v3" xsi:nil="true"/>
-    <ImageTagsTaxHTField xmlns="71af3243-3dd4-4a8d-8c0d-dd76da1f02a5">
-      <Terms xmlns="http://schemas.microsoft.com/office/infopath/2007/PartnerControls"/>
-    </ImageTagsTaxHTField>
-    <TaxCatchAll xmlns="230e9df3-be65-4c73-a93b-d1236ebd677e" xsi:nil="true"/>
-    <MediaServiceKeyPoints xmlns="71af3243-3dd4-4a8d-8c0d-dd76da1f02a5" xsi:nil="true"/>
-  </documentManagement>
-</p:properties>
-</file>
-
 <file path=customXml/item3.xml><?xml version="1.0" encoding="utf-8"?>
 <?mso-contentType ?>
 <FormTemplates xmlns="http://schemas.microsoft.com/sharepoint/v3/contenttype/forms">
@@ -5251,6 +5283,18 @@
 </file>
 
 <file path=customXml/itemProps1.xml><?xml version="1.0" encoding="utf-8"?>
+<ds:datastoreItem xmlns:ds="http://schemas.openxmlformats.org/officeDocument/2006/customXml" ds:itemID="{D189125E-F545-46E5-B780-871CAFC26324}">
+  <ds:schemaRefs>
+    <ds:schemaRef ds:uri="http://schemas.microsoft.com/office/2006/metadata/properties"/>
+    <ds:schemaRef ds:uri="http://schemas.microsoft.com/office/infopath/2007/PartnerControls"/>
+    <ds:schemaRef ds:uri="http://schemas.microsoft.com/sharepoint/v3"/>
+    <ds:schemaRef ds:uri="71af3243-3dd4-4a8d-8c0d-dd76da1f02a5"/>
+    <ds:schemaRef ds:uri="230e9df3-be65-4c73-a93b-d1236ebd677e"/>
+  </ds:schemaRefs>
+</ds:datastoreItem>
+</file>
+
+<file path=customXml/itemProps2.xml><?xml version="1.0" encoding="utf-8"?>
 <ds:datastoreItem xmlns:ds="http://schemas.openxmlformats.org/officeDocument/2006/customXml" ds:itemID="{33CF9CD8-197E-44B2-AC01-616EC0F8C03F}">
   <ds:schemaRefs>
     <ds:schemaRef ds:uri="http://schemas.microsoft.com/office/2006/metadata/contentType"/>
@@ -5271,18 +5315,6 @@
 </ds:datastoreItem>
 </file>
 
-<file path=customXml/itemProps2.xml><?xml version="1.0" encoding="utf-8"?>
-<ds:datastoreItem xmlns:ds="http://schemas.openxmlformats.org/officeDocument/2006/customXml" ds:itemID="{D189125E-F545-46E5-B780-871CAFC26324}">
-  <ds:schemaRefs>
-    <ds:schemaRef ds:uri="http://schemas.microsoft.com/office/2006/metadata/properties"/>
-    <ds:schemaRef ds:uri="http://schemas.microsoft.com/office/infopath/2007/PartnerControls"/>
-    <ds:schemaRef ds:uri="http://schemas.microsoft.com/sharepoint/v3"/>
-    <ds:schemaRef ds:uri="71af3243-3dd4-4a8d-8c0d-dd76da1f02a5"/>
-    <ds:schemaRef ds:uri="230e9df3-be65-4c73-a93b-d1236ebd677e"/>
-  </ds:schemaRefs>
-</ds:datastoreItem>
-</file>
-
 <file path=customXml/itemProps3.xml><?xml version="1.0" encoding="utf-8"?>
 <ds:datastoreItem xmlns:ds="http://schemas.openxmlformats.org/officeDocument/2006/customXml" ds:itemID="{0FBE260B-89FA-4C2A-8CC6-AF410096B44F}">
   <ds:schemaRefs>
@@ -5292,7 +5324,7 @@
 </file>
 
 <file path=customXml/itemProps4.xml><?xml version="1.0" encoding="utf-8"?>
-<ds:datastoreItem xmlns:ds="http://schemas.openxmlformats.org/officeDocument/2006/customXml" ds:itemID="{087BCC50-86F0-45C1-9692-D740B0A3C0B5}">
+<ds:datastoreItem xmlns:ds="http://schemas.openxmlformats.org/officeDocument/2006/customXml" ds:itemID="{F8B922BC-A13F-476C-9A96-80C157C88A2E}">
   <ds:schemaRefs>
     <ds:schemaRef ds:uri="http://schemas.openxmlformats.org/officeDocument/2006/bibliography"/>
   </ds:schemaRefs>

</xml_diff>

<commit_message>
Migración completa a motor Excel indestructible
</commit_message>
<xml_diff>
--- a/plantilla_int.docx
+++ b/plantilla_int.docx
@@ -646,7 +646,7 @@
                     </wp:anchor>
                   </w:drawing>
                 </mc:Choice>
-                <mc:Fallback xmlns:cx1="http://schemas.microsoft.com/office/drawing/2015/9/8/chartex" xmlns:cx2="http://schemas.microsoft.com/office/drawing/2015/10/21/chartex" xmlns:cx3="http://schemas.microsoft.com/office/drawing/2016/5/9/chartex" xmlns:cx4="http://schemas.microsoft.com/office/drawing/2016/5/10/chartex" xmlns:cx5="http://schemas.microsoft.com/office/drawing/2016/5/11/chartex" xmlns:cx6="http://schemas.microsoft.com/office/drawing/2016/5/12/chartex" xmlns:cx7="http://schemas.microsoft.com/office/drawing/2016/5/13/chartex" xmlns:cx8="http://schemas.microsoft.com/office/drawing/2016/5/14/chartex" xmlns:aink="http://schemas.microsoft.com/office/drawing/2016/ink" xmlns:am3d="http://schemas.microsoft.com/office/drawing/2017/model3d" xmlns:oel="http://schemas.microsoft.com/office/2019/extlst" xmlns:w16cex="http://schemas.microsoft.com/office/word/2018/wordml/cex" xmlns:w16cid="http://schemas.microsoft.com/office/word/2016/wordml/cid" xmlns:w16="http://schemas.microsoft.com/office/word/2018/wordml" xmlns:w16du="http://schemas.microsoft.com/office/word/2023/wordml/word16du" xmlns:w16sdtdh="http://schemas.microsoft.com/office/word/2020/wordml/sdtdatahash" xmlns:w16sdtfl="http://schemas.microsoft.com/office/word/2024/wordml/sdtformatlock">
+                <mc:Fallback xmlns:w16sdtfl="http://schemas.microsoft.com/office/word/2024/wordml/sdtformatlock" xmlns:w16sdtdh="http://schemas.microsoft.com/office/word/2020/wordml/sdtdatahash" xmlns:w16du="http://schemas.microsoft.com/office/word/2023/wordml/word16du" xmlns:w16="http://schemas.microsoft.com/office/word/2018/wordml" xmlns:w16cid="http://schemas.microsoft.com/office/word/2016/wordml/cid" xmlns:w16cex="http://schemas.microsoft.com/office/word/2018/wordml/cex" xmlns:oel="http://schemas.microsoft.com/office/2019/extlst" xmlns:am3d="http://schemas.microsoft.com/office/drawing/2017/model3d" xmlns:aink="http://schemas.microsoft.com/office/drawing/2016/ink" xmlns:cx8="http://schemas.microsoft.com/office/drawing/2016/5/14/chartex" xmlns:cx7="http://schemas.microsoft.com/office/drawing/2016/5/13/chartex" xmlns:cx6="http://schemas.microsoft.com/office/drawing/2016/5/12/chartex" xmlns:cx5="http://schemas.microsoft.com/office/drawing/2016/5/11/chartex" xmlns:cx4="http://schemas.microsoft.com/office/drawing/2016/5/10/chartex" xmlns:cx3="http://schemas.microsoft.com/office/drawing/2016/5/9/chartex" xmlns:cx2="http://schemas.microsoft.com/office/drawing/2015/10/21/chartex" xmlns:cx1="http://schemas.microsoft.com/office/drawing/2015/9/8/chartex">
                   <w:pict>
                     <v:line w14:anchorId="4C297CA5" id="Conector recto 6" o:spid="_x0000_s1026" style="position:absolute;flip:y;z-index:251670528;visibility:visible;mso-wrap-style:square;mso-wrap-distance-left:9pt;mso-wrap-distance-top:0;mso-wrap-distance-right:9pt;mso-wrap-distance-bottom:0;mso-position-horizontal:absolute;mso-position-horizontal-relative:text;mso-position-vertical:absolute;mso-position-vertical-relative:text" from="-47.5pt,8.85pt" to="508.7pt,11.25pt" o:gfxdata="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" strokecolor="black [3040]"/>
                   </w:pict>
@@ -1520,12 +1520,18 @@
               <w:rPr>
                 <w:noProof/>
               </w:rPr>
-              <w:t>{{ item.importe }}{% endfor %}</w:t>
+              <w:t xml:space="preserve">{{ item.importe </w:t>
+            </w:r>
+            <w:bookmarkStart w:id="1" w:name="_GoBack"/>
+            <w:bookmarkEnd w:id="1"/>
+            <w:r>
+              <w:rPr>
+                <w:noProof/>
+              </w:rPr>
+              <w:t>}}{% endfor %}</w:t>
             </w:r>
           </w:p>
         </w:tc>
-        <w:bookmarkStart w:id="1" w:name="_GoBack"/>
-        <w:bookmarkEnd w:id="1"/>
       </w:tr>
     </w:tbl>
     <w:tbl>
@@ -1883,7 +1889,7 @@
                             <a:alphaModFix amt="35000"/>
                             <a:extLst>
                               <a:ext uri="">
-                                <a14:useLocalDpi xmlns:cx1="http://schemas.microsoft.com/office/drawing/2015/9/8/chartex" xmlns:cx2="http://schemas.microsoft.com/office/drawing/2015/10/21/chartex" xmlns:cx3="http://schemas.microsoft.com/office/drawing/2016/5/9/chartex" xmlns:cx4="http://schemas.microsoft.com/office/drawing/2016/5/10/chartex" xmlns:cx5="http://schemas.microsoft.com/office/drawing/2016/5/11/chartex" xmlns:cx6="http://schemas.microsoft.com/office/drawing/2016/5/12/chartex" xmlns:cx7="http://schemas.microsoft.com/office/drawing/2016/5/13/chartex" xmlns:cx8="http://schemas.microsoft.com/office/drawing/2016/5/14/chartex" xmlns:aink="http://schemas.microsoft.com/office/drawing/2016/ink" xmlns:am3d="http://schemas.microsoft.com/office/drawing/2017/model3d" xmlns:oel="http://schemas.microsoft.com/office/2019/extlst" xmlns:w16cex="http://schemas.microsoft.com/office/word/2018/wordml/cex" xmlns:w16cid="http://schemas.microsoft.com/office/word/2016/wordml/cid" xmlns:w16="http://schemas.microsoft.com/office/word/2018/wordml" xmlns:w16du="http://schemas.microsoft.com/office/word/2023/wordml/word16du" xmlns:w16sdtdh="http://schemas.microsoft.com/office/word/2020/wordml/sdtdatahash" xmlns:w16sdtfl="http://schemas.microsoft.com/office/word/2024/wordml/sdtformatlock" xmlns="" xmlns:o="urn:schemas-microsoft-com:office:office" xmlns:v="urn:schemas-microsoft-com:vml" xmlns:w10="urn:schemas-microsoft-com:office:word" xmlns:w="http://schemas.openxmlformats.org/wordprocessingml/2006/main" xmlns:a14="http://schemas.microsoft.com/office/drawing/2010/main" val="0"/>
+                                <a14:useLocalDpi xmlns:a14="http://schemas.microsoft.com/office/drawing/2010/main" xmlns:w="http://schemas.openxmlformats.org/wordprocessingml/2006/main" xmlns:w10="urn:schemas-microsoft-com:office:word" xmlns:v="urn:schemas-microsoft-com:vml" xmlns:o="urn:schemas-microsoft-com:office:office" xmlns="" xmlns:w16sdtfl="http://schemas.microsoft.com/office/word/2024/wordml/sdtformatlock" xmlns:w16sdtdh="http://schemas.microsoft.com/office/word/2020/wordml/sdtdatahash" xmlns:w16du="http://schemas.microsoft.com/office/word/2023/wordml/word16du" xmlns:w16="http://schemas.microsoft.com/office/word/2018/wordml" xmlns:w16cid="http://schemas.microsoft.com/office/word/2016/wordml/cid" xmlns:w16cex="http://schemas.microsoft.com/office/word/2018/wordml/cex" xmlns:oel="http://schemas.microsoft.com/office/2019/extlst" xmlns:am3d="http://schemas.microsoft.com/office/drawing/2017/model3d" xmlns:aink="http://schemas.microsoft.com/office/drawing/2016/ink" xmlns:cx8="http://schemas.microsoft.com/office/drawing/2016/5/14/chartex" xmlns:cx7="http://schemas.microsoft.com/office/drawing/2016/5/13/chartex" xmlns:cx6="http://schemas.microsoft.com/office/drawing/2016/5/12/chartex" xmlns:cx5="http://schemas.microsoft.com/office/drawing/2016/5/11/chartex" xmlns:cx4="http://schemas.microsoft.com/office/drawing/2016/5/10/chartex" xmlns:cx3="http://schemas.microsoft.com/office/drawing/2016/5/9/chartex" xmlns:cx2="http://schemas.microsoft.com/office/drawing/2015/10/21/chartex" xmlns:cx1="http://schemas.microsoft.com/office/drawing/2015/9/8/chartex" val="0"/>
                               </a:ext>
                             </a:extLst>
                           </a:blip>
@@ -1976,7 +1982,7 @@
                     </wp:anchor>
                   </w:drawing>
                 </mc:Choice>
-                <mc:Fallback xmlns:cx1="http://schemas.microsoft.com/office/drawing/2015/9/8/chartex" xmlns:cx2="http://schemas.microsoft.com/office/drawing/2015/10/21/chartex" xmlns:cx3="http://schemas.microsoft.com/office/drawing/2016/5/9/chartex" xmlns:cx4="http://schemas.microsoft.com/office/drawing/2016/5/10/chartex" xmlns:cx5="http://schemas.microsoft.com/office/drawing/2016/5/11/chartex" xmlns:cx6="http://schemas.microsoft.com/office/drawing/2016/5/12/chartex" xmlns:cx7="http://schemas.microsoft.com/office/drawing/2016/5/13/chartex" xmlns:cx8="http://schemas.microsoft.com/office/drawing/2016/5/14/chartex" xmlns:aink="http://schemas.microsoft.com/office/drawing/2016/ink" xmlns:am3d="http://schemas.microsoft.com/office/drawing/2017/model3d" xmlns:oel="http://schemas.microsoft.com/office/2019/extlst" xmlns:w16cex="http://schemas.microsoft.com/office/word/2018/wordml/cex" xmlns:w16cid="http://schemas.microsoft.com/office/word/2016/wordml/cid" xmlns:w16="http://schemas.microsoft.com/office/word/2018/wordml" xmlns:w16du="http://schemas.microsoft.com/office/word/2023/wordml/word16du" xmlns:w16sdtdh="http://schemas.microsoft.com/office/word/2020/wordml/sdtdatahash" xmlns:w16sdtfl="http://schemas.microsoft.com/office/word/2024/wordml/sdtformatlock">
+                <mc:Fallback xmlns:w16sdtfl="http://schemas.microsoft.com/office/word/2024/wordml/sdtformatlock" xmlns:w16sdtdh="http://schemas.microsoft.com/office/word/2020/wordml/sdtdatahash" xmlns:w16du="http://schemas.microsoft.com/office/word/2023/wordml/word16du" xmlns:w16="http://schemas.microsoft.com/office/word/2018/wordml" xmlns:w16cid="http://schemas.microsoft.com/office/word/2016/wordml/cid" xmlns:w16cex="http://schemas.microsoft.com/office/word/2018/wordml/cex" xmlns:oel="http://schemas.microsoft.com/office/2019/extlst" xmlns:am3d="http://schemas.microsoft.com/office/drawing/2017/model3d" xmlns:aink="http://schemas.microsoft.com/office/drawing/2016/ink" xmlns:cx8="http://schemas.microsoft.com/office/drawing/2016/5/14/chartex" xmlns:cx7="http://schemas.microsoft.com/office/drawing/2016/5/13/chartex" xmlns:cx6="http://schemas.microsoft.com/office/drawing/2016/5/12/chartex" xmlns:cx5="http://schemas.microsoft.com/office/drawing/2016/5/11/chartex" xmlns:cx4="http://schemas.microsoft.com/office/drawing/2016/5/10/chartex" xmlns:cx3="http://schemas.microsoft.com/office/drawing/2016/5/9/chartex" xmlns:cx2="http://schemas.microsoft.com/office/drawing/2015/10/21/chartex" xmlns:cx1="http://schemas.microsoft.com/office/drawing/2015/9/8/chartex">
                   <w:pict>
                     <v:line w14:anchorId="22A5DB73" id="Conector recto 9" o:spid="_x0000_s1026" style="position:absolute;z-index:251676672;visibility:visible;mso-wrap-style:square;mso-width-percent:0;mso-height-percent:0;mso-wrap-distance-left:9pt;mso-wrap-distance-top:0;mso-wrap-distance-right:9pt;mso-wrap-distance-bottom:0;mso-position-horizontal:absolute;mso-position-horizontal-relative:text;mso-position-vertical:absolute;mso-position-vertical-relative:text;mso-width-percent:0;mso-height-percent:0;mso-width-relative:margin;mso-height-relative:margin" from="332.05pt,86.85pt" to="467.65pt,86.85pt" o:gfxdata="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" strokecolor="black [3040]"/>
                   </w:pict>
@@ -4938,26 +4944,6 @@
 </file>
 
 <file path=customXml/item1.xml><?xml version="1.0" encoding="utf-8"?>
-<p:properties xmlns:p="http://schemas.microsoft.com/office/2006/metadata/properties" xmlns:xsi="http://www.w3.org/2001/XMLSchema-instance" xmlns:pc="http://schemas.microsoft.com/office/infopath/2007/PartnerControls">
-  <documentManagement>
-    <_ip_UnifiedCompliancePolicyUIAction xmlns="http://schemas.microsoft.com/sharepoint/v3" xsi:nil="true"/>
-    <Image xmlns="71af3243-3dd4-4a8d-8c0d-dd76da1f02a5">
-      <Url xsi:nil="true"/>
-      <Description xsi:nil="true"/>
-    </Image>
-    <Status xmlns="71af3243-3dd4-4a8d-8c0d-dd76da1f02a5">Not started</Status>
-    <Background xmlns="71af3243-3dd4-4a8d-8c0d-dd76da1f02a5">false</Background>
-    <_ip_UnifiedCompliancePolicyProperties xmlns="http://schemas.microsoft.com/sharepoint/v3" xsi:nil="true"/>
-    <ImageTagsTaxHTField xmlns="71af3243-3dd4-4a8d-8c0d-dd76da1f02a5">
-      <Terms xmlns="http://schemas.microsoft.com/office/infopath/2007/PartnerControls"/>
-    </ImageTagsTaxHTField>
-    <TaxCatchAll xmlns="230e9df3-be65-4c73-a93b-d1236ebd677e" xsi:nil="true"/>
-    <MediaServiceKeyPoints xmlns="71af3243-3dd4-4a8d-8c0d-dd76da1f02a5" xsi:nil="true"/>
-  </documentManagement>
-</p:properties>
-</file>
-
-<file path=customXml/item2.xml><?xml version="1.0" encoding="utf-8"?>
 <ct:contentTypeSchema xmlns:ct="http://schemas.microsoft.com/office/2006/metadata/contentType" xmlns:ma="http://schemas.microsoft.com/office/2006/metadata/properties/metaAttributes" ct:_="" ma:_="" ma:contentTypeName="Document" ma:contentTypeID="0x01010079F111ED35F8CC479449609E8A0923A6" ma:contentTypeVersion="26" ma:contentTypeDescription="Create a new document." ma:contentTypeScope="" ma:versionID="ac37c1753acd5e330d2062ccec26ea66">
   <xsd:schema xmlns:xsd="http://www.w3.org/2001/XMLSchema" xmlns:xs="http://www.w3.org/2001/XMLSchema" xmlns:p="http://schemas.microsoft.com/office/2006/metadata/properties" xmlns:ns1="http://schemas.microsoft.com/sharepoint/v3" xmlns:ns2="71af3243-3dd4-4a8d-8c0d-dd76da1f02a5" xmlns:ns3="16c05727-aa75-4e4a-9b5f-8a80a1165891" xmlns:ns4="230e9df3-be65-4c73-a93b-d1236ebd677e" targetNamespace="http://schemas.microsoft.com/office/2006/metadata/properties" ma:root="true" ma:fieldsID="3b340c7101c92c5120abd06486f94548" ns1:_="" ns2:_="" ns3:_="" ns4:_="">
     <xsd:import namespace="http://schemas.microsoft.com/sharepoint/v3"/>
@@ -5257,6 +5243,26 @@
 </ct:contentTypeSchema>
 </file>
 
+<file path=customXml/item2.xml><?xml version="1.0" encoding="utf-8"?>
+<p:properties xmlns:p="http://schemas.microsoft.com/office/2006/metadata/properties" xmlns:xsi="http://www.w3.org/2001/XMLSchema-instance" xmlns:pc="http://schemas.microsoft.com/office/infopath/2007/PartnerControls">
+  <documentManagement>
+    <_ip_UnifiedCompliancePolicyUIAction xmlns="http://schemas.microsoft.com/sharepoint/v3" xsi:nil="true"/>
+    <Image xmlns="71af3243-3dd4-4a8d-8c0d-dd76da1f02a5">
+      <Url xsi:nil="true"/>
+      <Description xsi:nil="true"/>
+    </Image>
+    <Status xmlns="71af3243-3dd4-4a8d-8c0d-dd76da1f02a5">Not started</Status>
+    <Background xmlns="71af3243-3dd4-4a8d-8c0d-dd76da1f02a5">false</Background>
+    <_ip_UnifiedCompliancePolicyProperties xmlns="http://schemas.microsoft.com/sharepoint/v3" xsi:nil="true"/>
+    <ImageTagsTaxHTField xmlns="71af3243-3dd4-4a8d-8c0d-dd76da1f02a5">
+      <Terms xmlns="http://schemas.microsoft.com/office/infopath/2007/PartnerControls"/>
+    </ImageTagsTaxHTField>
+    <TaxCatchAll xmlns="230e9df3-be65-4c73-a93b-d1236ebd677e" xsi:nil="true"/>
+    <MediaServiceKeyPoints xmlns="71af3243-3dd4-4a8d-8c0d-dd76da1f02a5" xsi:nil="true"/>
+  </documentManagement>
+</p:properties>
+</file>
+
 <file path=customXml/item3.xml><?xml version="1.0" encoding="utf-8"?>
 <?mso-contentType ?>
 <FormTemplates xmlns="http://schemas.microsoft.com/sharepoint/v3/contenttype/forms">
@@ -5271,18 +5277,6 @@
 </file>
 
 <file path=customXml/itemProps1.xml><?xml version="1.0" encoding="utf-8"?>
-<ds:datastoreItem xmlns:ds="http://schemas.openxmlformats.org/officeDocument/2006/customXml" ds:itemID="{D189125E-F545-46E5-B780-871CAFC26324}">
-  <ds:schemaRefs>
-    <ds:schemaRef ds:uri="http://schemas.microsoft.com/office/2006/metadata/properties"/>
-    <ds:schemaRef ds:uri="http://schemas.microsoft.com/office/infopath/2007/PartnerControls"/>
-    <ds:schemaRef ds:uri="http://schemas.microsoft.com/sharepoint/v3"/>
-    <ds:schemaRef ds:uri="71af3243-3dd4-4a8d-8c0d-dd76da1f02a5"/>
-    <ds:schemaRef ds:uri="230e9df3-be65-4c73-a93b-d1236ebd677e"/>
-  </ds:schemaRefs>
-</ds:datastoreItem>
-</file>
-
-<file path=customXml/itemProps2.xml><?xml version="1.0" encoding="utf-8"?>
 <ds:datastoreItem xmlns:ds="http://schemas.openxmlformats.org/officeDocument/2006/customXml" ds:itemID="{33CF9CD8-197E-44B2-AC01-616EC0F8C03F}">
   <ds:schemaRefs>
     <ds:schemaRef ds:uri="http://schemas.microsoft.com/office/2006/metadata/contentType"/>
@@ -5303,6 +5297,18 @@
 </ds:datastoreItem>
 </file>
 
+<file path=customXml/itemProps2.xml><?xml version="1.0" encoding="utf-8"?>
+<ds:datastoreItem xmlns:ds="http://schemas.openxmlformats.org/officeDocument/2006/customXml" ds:itemID="{D189125E-F545-46E5-B780-871CAFC26324}">
+  <ds:schemaRefs>
+    <ds:schemaRef ds:uri="http://schemas.microsoft.com/office/2006/metadata/properties"/>
+    <ds:schemaRef ds:uri="http://schemas.microsoft.com/office/infopath/2007/PartnerControls"/>
+    <ds:schemaRef ds:uri="http://schemas.microsoft.com/sharepoint/v3"/>
+    <ds:schemaRef ds:uri="71af3243-3dd4-4a8d-8c0d-dd76da1f02a5"/>
+    <ds:schemaRef ds:uri="230e9df3-be65-4c73-a93b-d1236ebd677e"/>
+  </ds:schemaRefs>
+</ds:datastoreItem>
+</file>
+
 <file path=customXml/itemProps3.xml><?xml version="1.0" encoding="utf-8"?>
 <ds:datastoreItem xmlns:ds="http://schemas.openxmlformats.org/officeDocument/2006/customXml" ds:itemID="{0FBE260B-89FA-4C2A-8CC6-AF410096B44F}">
   <ds:schemaRefs>
@@ -5312,7 +5318,7 @@
 </file>
 
 <file path=customXml/itemProps4.xml><?xml version="1.0" encoding="utf-8"?>
-<ds:datastoreItem xmlns:ds="http://schemas.openxmlformats.org/officeDocument/2006/customXml" ds:itemID="{587BCA48-A41A-4E96-A5BA-5D222A24E90D}">
+<ds:datastoreItem xmlns:ds="http://schemas.openxmlformats.org/officeDocument/2006/customXml" ds:itemID="{397F25CF-BB9D-4053-8E4B-55C71EF2A60D}">
   <ds:schemaRefs>
     <ds:schemaRef ds:uri="http://schemas.openxmlformats.org/officeDocument/2006/bibliography"/>
   </ds:schemaRefs>

</xml_diff>